<commit_message>
t4 and documentation modified
</commit_message>
<xml_diff>
--- a/docs/BT_CW_15764609.docx
+++ b/docs/BT_CW_15764609.docx
@@ -520,6 +520,14 @@
     </w:p>
     <w:sdt>
       <w:sdtPr>
+        <w:rPr>
+          <w:rFonts w:asciiTheme="minorHAnsi" w:eastAsiaTheme="minorHAnsi" w:hAnsiTheme="minorHAnsi" w:cstheme="minorBidi"/>
+          <w:color w:val="auto"/>
+          <w:kern w:val="2"/>
+          <w:sz w:val="24"/>
+          <w:szCs w:val="24"/>
+          <w14:ligatures w14:val="standardContextual"/>
+        </w:rPr>
         <w:id w:val="1548796362"/>
         <w:docPartObj>
           <w:docPartGallery w:val="Table of Contents"/>
@@ -528,15 +536,9 @@
       </w:sdtPr>
       <w:sdtEndPr>
         <w:rPr>
-          <w:rFonts w:asciiTheme="minorHAnsi" w:eastAsiaTheme="minorHAnsi" w:hAnsiTheme="minorHAnsi" w:cstheme="minorBidi"/>
           <w:b/>
           <w:bCs/>
           <w:noProof/>
-          <w:color w:val="auto"/>
-          <w:kern w:val="2"/>
-          <w:sz w:val="24"/>
-          <w:szCs w:val="24"/>
-          <w14:ligatures w14:val="standardContextual"/>
         </w:rPr>
       </w:sdtEndPr>
       <w:sdtContent>
@@ -2334,7 +2336,15 @@
     </w:p>
     <w:p>
       <w:r>
-        <w:t>YARN ResourceManager UI (http://localhost:8088)</w:t>
+        <w:t xml:space="preserve">YARN </w:t>
+      </w:r>
+      <w:proofErr w:type="spellStart"/>
+      <w:r>
+        <w:t>ResourceManager</w:t>
+      </w:r>
+      <w:proofErr w:type="spellEnd"/>
+      <w:r>
+        <w:t xml:space="preserve"> UI (http://localhost:8088)</w:t>
       </w:r>
     </w:p>
     <w:p>
@@ -2343,7 +2353,7 @@
           <w:noProof/>
         </w:rPr>
         <w:drawing>
-          <wp:anchor distT="0" distB="0" distL="114300" distR="114300" simplePos="0" relativeHeight="251672576" behindDoc="1" locked="0" layoutInCell="1" allowOverlap="1" wp14:anchorId="7CF29EC3" wp14:editId="79FEBB17">
+          <wp:anchor distT="0" distB="0" distL="114300" distR="114300" simplePos="0" relativeHeight="251672576" behindDoc="1" locked="0" layoutInCell="1" allowOverlap="1" wp14:anchorId="7CF29EC3" wp14:editId="6EF078FD">
             <wp:simplePos x="0" y="0"/>
             <wp:positionH relativeFrom="column">
               <wp:posOffset>47625</wp:posOffset>
@@ -2604,7 +2614,15 @@
     <w:p>
       <w:r>
         <w:lastRenderedPageBreak/>
-        <w:t>HDFS NameNode UI (http://localhost:9870)</w:t>
+        <w:t xml:space="preserve">HDFS </w:t>
+      </w:r>
+      <w:proofErr w:type="spellStart"/>
+      <w:r>
+        <w:t>NameNode</w:t>
+      </w:r>
+      <w:proofErr w:type="spellEnd"/>
+      <w:r>
+        <w:t xml:space="preserve"> UI (http://localhost:9870)</w:t>
       </w:r>
     </w:p>
     <w:p>
@@ -3319,8 +3337,13 @@
         <w:t xml:space="preserve"> for </w:t>
       </w:r>
       <w:r>
-        <w:t>soc-Pokec</w:t>
-      </w:r>
+        <w:t>soc-</w:t>
+      </w:r>
+      <w:proofErr w:type="spellStart"/>
+      <w:r>
+        <w:t>Pokec</w:t>
+      </w:r>
+      <w:proofErr w:type="spellEnd"/>
       <w:r>
         <w:t xml:space="preserve"> dataset</w:t>
       </w:r>
@@ -4704,29 +4727,54 @@
                 <w:sz w:val="20"/>
                 <w:szCs w:val="20"/>
               </w:rPr>
-              <w:t>191,210 ms</w:t>
-            </w:r>
-          </w:p>
-        </w:tc>
-        <w:tc>
-          <w:tcPr>
-            <w:tcW w:w="0" w:type="auto"/>
-            <w:hideMark/>
-          </w:tcPr>
-          <w:p>
-            <w:pPr>
-              <w:spacing w:line="278" w:lineRule="auto"/>
-              <w:rPr>
-                <w:sz w:val="20"/>
-                <w:szCs w:val="20"/>
-              </w:rPr>
-            </w:pPr>
-            <w:r>
-              <w:rPr>
-                <w:sz w:val="20"/>
-                <w:szCs w:val="20"/>
-              </w:rPr>
-              <w:t>~94,000 ms (calculated)</w:t>
+              <w:t xml:space="preserve">191,210 </w:t>
+            </w:r>
+            <w:proofErr w:type="spellStart"/>
+            <w:r>
+              <w:rPr>
+                <w:sz w:val="20"/>
+                <w:szCs w:val="20"/>
+              </w:rPr>
+              <w:t>ms</w:t>
+            </w:r>
+            <w:proofErr w:type="spellEnd"/>
+          </w:p>
+        </w:tc>
+        <w:tc>
+          <w:tcPr>
+            <w:tcW w:w="0" w:type="auto"/>
+            <w:hideMark/>
+          </w:tcPr>
+          <w:p>
+            <w:pPr>
+              <w:spacing w:line="278" w:lineRule="auto"/>
+              <w:rPr>
+                <w:sz w:val="20"/>
+                <w:szCs w:val="20"/>
+              </w:rPr>
+            </w:pPr>
+            <w:r>
+              <w:rPr>
+                <w:sz w:val="20"/>
+                <w:szCs w:val="20"/>
+              </w:rPr>
+              <w:t xml:space="preserve">~94,000 </w:t>
+            </w:r>
+            <w:proofErr w:type="spellStart"/>
+            <w:r>
+              <w:rPr>
+                <w:sz w:val="20"/>
+                <w:szCs w:val="20"/>
+              </w:rPr>
+              <w:t>ms</w:t>
+            </w:r>
+            <w:proofErr w:type="spellEnd"/>
+            <w:r>
+              <w:rPr>
+                <w:sz w:val="20"/>
+                <w:szCs w:val="20"/>
+              </w:rPr>
+              <w:t xml:space="preserve"> (calculated)</w:t>
             </w:r>
           </w:p>
         </w:tc>
@@ -7005,7 +7053,15 @@
         <w:t>Performance Metrics Comparison</w:t>
       </w:r>
       <w:r>
-        <w:t xml:space="preserve"> for email-EuAll dataset</w:t>
+        <w:t xml:space="preserve"> for email-</w:t>
+      </w:r>
+      <w:proofErr w:type="spellStart"/>
+      <w:r>
+        <w:t>EuAll</w:t>
+      </w:r>
+      <w:proofErr w:type="spellEnd"/>
+      <w:r>
+        <w:t xml:space="preserve"> dataset</w:t>
       </w:r>
     </w:p>
     <w:p>
@@ -8389,29 +8445,54 @@
                 <w:sz w:val="20"/>
                 <w:szCs w:val="20"/>
               </w:rPr>
-              <w:t>10,980 ms</w:t>
-            </w:r>
-          </w:p>
-        </w:tc>
-        <w:tc>
-          <w:tcPr>
-            <w:tcW w:w="0" w:type="auto"/>
-            <w:hideMark/>
-          </w:tcPr>
-          <w:p>
-            <w:pPr>
-              <w:spacing w:line="278" w:lineRule="auto"/>
-              <w:rPr>
-                <w:sz w:val="20"/>
-                <w:szCs w:val="20"/>
-              </w:rPr>
-            </w:pPr>
-            <w:r>
-              <w:rPr>
-                <w:sz w:val="20"/>
-                <w:szCs w:val="20"/>
-              </w:rPr>
-              <w:t>~1,400 ms (calculated)</w:t>
+              <w:t xml:space="preserve">10,980 </w:t>
+            </w:r>
+            <w:proofErr w:type="spellStart"/>
+            <w:r>
+              <w:rPr>
+                <w:sz w:val="20"/>
+                <w:szCs w:val="20"/>
+              </w:rPr>
+              <w:t>ms</w:t>
+            </w:r>
+            <w:proofErr w:type="spellEnd"/>
+          </w:p>
+        </w:tc>
+        <w:tc>
+          <w:tcPr>
+            <w:tcW w:w="0" w:type="auto"/>
+            <w:hideMark/>
+          </w:tcPr>
+          <w:p>
+            <w:pPr>
+              <w:spacing w:line="278" w:lineRule="auto"/>
+              <w:rPr>
+                <w:sz w:val="20"/>
+                <w:szCs w:val="20"/>
+              </w:rPr>
+            </w:pPr>
+            <w:r>
+              <w:rPr>
+                <w:sz w:val="20"/>
+                <w:szCs w:val="20"/>
+              </w:rPr>
+              <w:t xml:space="preserve">~1,400 </w:t>
+            </w:r>
+            <w:proofErr w:type="spellStart"/>
+            <w:r>
+              <w:rPr>
+                <w:sz w:val="20"/>
+                <w:szCs w:val="20"/>
+              </w:rPr>
+              <w:t>ms</w:t>
+            </w:r>
+            <w:proofErr w:type="spellEnd"/>
+            <w:r>
+              <w:rPr>
+                <w:sz w:val="20"/>
+                <w:szCs w:val="20"/>
+              </w:rPr>
+              <w:t xml:space="preserve"> (calculated)</w:t>
             </w:r>
           </w:p>
         </w:tc>
@@ -9743,29 +9824,61 @@
                 <w:sz w:val="20"/>
                 <w:szCs w:val="20"/>
               </w:rPr>
-              <w:t>10,980 ms total</w:t>
-            </w:r>
-          </w:p>
-        </w:tc>
-        <w:tc>
-          <w:tcPr>
-            <w:tcW w:w="0" w:type="auto"/>
-            <w:hideMark/>
-          </w:tcPr>
-          <w:p>
-            <w:pPr>
-              <w:spacing w:line="278" w:lineRule="auto"/>
-              <w:rPr>
-                <w:sz w:val="20"/>
-                <w:szCs w:val="20"/>
-              </w:rPr>
-            </w:pPr>
-            <w:r>
-              <w:rPr>
-                <w:sz w:val="20"/>
-                <w:szCs w:val="20"/>
-              </w:rPr>
-              <w:t>~1,400 ms total</w:t>
+              <w:t xml:space="preserve">10,980 </w:t>
+            </w:r>
+            <w:proofErr w:type="spellStart"/>
+            <w:r>
+              <w:rPr>
+                <w:sz w:val="20"/>
+                <w:szCs w:val="20"/>
+              </w:rPr>
+              <w:t>ms</w:t>
+            </w:r>
+            <w:proofErr w:type="spellEnd"/>
+            <w:r>
+              <w:rPr>
+                <w:sz w:val="20"/>
+                <w:szCs w:val="20"/>
+              </w:rPr>
+              <w:t xml:space="preserve"> total</w:t>
+            </w:r>
+          </w:p>
+        </w:tc>
+        <w:tc>
+          <w:tcPr>
+            <w:tcW w:w="0" w:type="auto"/>
+            <w:hideMark/>
+          </w:tcPr>
+          <w:p>
+            <w:pPr>
+              <w:spacing w:line="278" w:lineRule="auto"/>
+              <w:rPr>
+                <w:sz w:val="20"/>
+                <w:szCs w:val="20"/>
+              </w:rPr>
+            </w:pPr>
+            <w:r>
+              <w:rPr>
+                <w:sz w:val="20"/>
+                <w:szCs w:val="20"/>
+              </w:rPr>
+              <w:t xml:space="preserve">~1,400 </w:t>
+            </w:r>
+            <w:proofErr w:type="spellStart"/>
+            <w:r>
+              <w:rPr>
+                <w:sz w:val="20"/>
+                <w:szCs w:val="20"/>
+              </w:rPr>
+              <w:t>ms</w:t>
+            </w:r>
+            <w:proofErr w:type="spellEnd"/>
+            <w:r>
+              <w:rPr>
+                <w:sz w:val="20"/>
+                <w:szCs w:val="20"/>
+              </w:rPr>
+              <w:t xml:space="preserve"> total</w:t>
             </w:r>
           </w:p>
         </w:tc>
@@ -10558,7 +10671,7 @@
           <w:noProof/>
         </w:rPr>
         <w:drawing>
-          <wp:anchor distT="0" distB="0" distL="114300" distR="114300" simplePos="0" relativeHeight="251676672" behindDoc="1" locked="0" layoutInCell="1" allowOverlap="1" wp14:anchorId="19F71410" wp14:editId="755FDF19">
+          <wp:anchor distT="0" distB="0" distL="114300" distR="114300" simplePos="0" relativeHeight="251676672" behindDoc="1" locked="0" layoutInCell="1" allowOverlap="1" wp14:anchorId="19F71410" wp14:editId="0BFC73BB">
             <wp:simplePos x="0" y="0"/>
             <wp:positionH relativeFrom="column">
               <wp:posOffset>643103</wp:posOffset>
@@ -10653,7 +10766,15 @@
         <w:t>Performance Metrics Comparison</w:t>
       </w:r>
       <w:r>
-        <w:t xml:space="preserve"> for web-BerkStan dataset</w:t>
+        <w:t xml:space="preserve"> for web-</w:t>
+      </w:r>
+      <w:proofErr w:type="spellStart"/>
+      <w:r>
+        <w:t>BerkStan</w:t>
+      </w:r>
+      <w:proofErr w:type="spellEnd"/>
+      <w:r>
+        <w:t xml:space="preserve"> dataset</w:t>
       </w:r>
     </w:p>
     <w:p>
@@ -12026,8 +12147,17 @@
                 <w:sz w:val="20"/>
                 <w:szCs w:val="20"/>
               </w:rPr>
-              <w:t>30,040 ms</w:t>
-            </w:r>
+              <w:t xml:space="preserve">30,040 </w:t>
+            </w:r>
+            <w:proofErr w:type="spellStart"/>
+            <w:r>
+              <w:rPr>
+                <w:sz w:val="20"/>
+                <w:szCs w:val="20"/>
+              </w:rPr>
+              <w:t>ms</w:t>
+            </w:r>
+            <w:proofErr w:type="spellEnd"/>
           </w:p>
         </w:tc>
         <w:tc>
@@ -12048,7 +12178,23 @@
                 <w:sz w:val="20"/>
                 <w:szCs w:val="20"/>
               </w:rPr>
-              <w:t>~4,500 ms (calculated)</w:t>
+              <w:t xml:space="preserve">~4,500 </w:t>
+            </w:r>
+            <w:proofErr w:type="spellStart"/>
+            <w:r>
+              <w:rPr>
+                <w:sz w:val="20"/>
+                <w:szCs w:val="20"/>
+              </w:rPr>
+              <w:t>ms</w:t>
+            </w:r>
+            <w:proofErr w:type="spellEnd"/>
+            <w:r>
+              <w:rPr>
+                <w:sz w:val="20"/>
+                <w:szCs w:val="20"/>
+              </w:rPr>
+              <w:t xml:space="preserve"> (calculated)</w:t>
             </w:r>
           </w:p>
         </w:tc>
@@ -13360,29 +13506,61 @@
                 <w:sz w:val="20"/>
                 <w:szCs w:val="20"/>
               </w:rPr>
-              <w:t>30,040 ms total</w:t>
-            </w:r>
-          </w:p>
-        </w:tc>
-        <w:tc>
-          <w:tcPr>
-            <w:tcW w:w="0" w:type="auto"/>
-            <w:hideMark/>
-          </w:tcPr>
-          <w:p>
-            <w:pPr>
-              <w:spacing w:line="278" w:lineRule="auto"/>
-              <w:rPr>
-                <w:sz w:val="20"/>
-                <w:szCs w:val="20"/>
-              </w:rPr>
-            </w:pPr>
-            <w:r>
-              <w:rPr>
-                <w:sz w:val="20"/>
-                <w:szCs w:val="20"/>
-              </w:rPr>
-              <w:t>~4,500 ms total</w:t>
+              <w:t xml:space="preserve">30,040 </w:t>
+            </w:r>
+            <w:proofErr w:type="spellStart"/>
+            <w:r>
+              <w:rPr>
+                <w:sz w:val="20"/>
+                <w:szCs w:val="20"/>
+              </w:rPr>
+              <w:t>ms</w:t>
+            </w:r>
+            <w:proofErr w:type="spellEnd"/>
+            <w:r>
+              <w:rPr>
+                <w:sz w:val="20"/>
+                <w:szCs w:val="20"/>
+              </w:rPr>
+              <w:t xml:space="preserve"> total</w:t>
+            </w:r>
+          </w:p>
+        </w:tc>
+        <w:tc>
+          <w:tcPr>
+            <w:tcW w:w="0" w:type="auto"/>
+            <w:hideMark/>
+          </w:tcPr>
+          <w:p>
+            <w:pPr>
+              <w:spacing w:line="278" w:lineRule="auto"/>
+              <w:rPr>
+                <w:sz w:val="20"/>
+                <w:szCs w:val="20"/>
+              </w:rPr>
+            </w:pPr>
+            <w:r>
+              <w:rPr>
+                <w:sz w:val="20"/>
+                <w:szCs w:val="20"/>
+              </w:rPr>
+              <w:t xml:space="preserve">~4,500 </w:t>
+            </w:r>
+            <w:proofErr w:type="spellStart"/>
+            <w:r>
+              <w:rPr>
+                <w:sz w:val="20"/>
+                <w:szCs w:val="20"/>
+              </w:rPr>
+              <w:t>ms</w:t>
+            </w:r>
+            <w:proofErr w:type="spellEnd"/>
+            <w:r>
+              <w:rPr>
+                <w:sz w:val="20"/>
+                <w:szCs w:val="20"/>
+              </w:rPr>
+              <w:t xml:space="preserve"> total</w:t>
             </w:r>
           </w:p>
         </w:tc>
@@ -16847,8 +17025,13 @@
         <w:spacing w:after="0"/>
       </w:pPr>
       <w:r>
-        <w:t>Tools: Grafana, Kafdrop</w:t>
-      </w:r>
+        <w:t xml:space="preserve">Tools: Grafana, </w:t>
+      </w:r>
+      <w:proofErr w:type="spellStart"/>
+      <w:r>
+        <w:t>Kafdrop</w:t>
+      </w:r>
+      <w:proofErr w:type="spellEnd"/>
     </w:p>
     <w:p/>
     <w:p>
@@ -16892,8 +17075,13 @@
         </w:numPr>
         <w:spacing w:after="0"/>
       </w:pPr>
-      <w:r>
-        <w:t>kafka-python - Kafka client library</w:t>
+      <w:proofErr w:type="spellStart"/>
+      <w:r>
+        <w:t>kafka</w:t>
+      </w:r>
+      <w:proofErr w:type="spellEnd"/>
+      <w:r>
+        <w:t>-python - Kafka client library</w:t>
       </w:r>
     </w:p>
     <w:p>
@@ -16904,8 +17092,13 @@
         </w:numPr>
         <w:spacing w:after="0"/>
       </w:pPr>
-      <w:r>
-        <w:t>pyyaml - YAML configuration parsing</w:t>
+      <w:proofErr w:type="spellStart"/>
+      <w:r>
+        <w:t>pyyaml</w:t>
+      </w:r>
+      <w:proofErr w:type="spellEnd"/>
+      <w:r>
+        <w:t xml:space="preserve"> - YAML configuration parsing</w:t>
       </w:r>
     </w:p>
     <w:p>
@@ -16928,8 +17121,13 @@
         </w:numPr>
         <w:spacing w:after="0"/>
       </w:pPr>
-      <w:r>
-        <w:t>sodapy - Socrata Open Data API client</w:t>
+      <w:proofErr w:type="spellStart"/>
+      <w:r>
+        <w:t>sodapy</w:t>
+      </w:r>
+      <w:proofErr w:type="spellEnd"/>
+      <w:r>
+        <w:t xml:space="preserve"> - Socrata Open Data API client</w:t>
       </w:r>
     </w:p>
     <w:p/>
@@ -16983,8 +17181,13 @@
         </w:numPr>
         <w:spacing w:after="0"/>
       </w:pPr>
-      <w:r>
-        <w:t>Kafdrop - Kafka Cluster Management &amp; Debugging</w:t>
+      <w:proofErr w:type="spellStart"/>
+      <w:r>
+        <w:t>Kafdrop</w:t>
+      </w:r>
+      <w:proofErr w:type="spellEnd"/>
+      <w:r>
+        <w:t xml:space="preserve"> - Kafka Cluster Management &amp; Debugging</w:t>
       </w:r>
     </w:p>
     <w:p>
@@ -17102,8 +17305,13 @@
         </w:numPr>
         <w:spacing w:after="0"/>
       </w:pPr>
-      <w:r>
-        <w:t>Kafdrop: 9000</w:t>
+      <w:proofErr w:type="spellStart"/>
+      <w:r>
+        <w:t>Kafdrop</w:t>
+      </w:r>
+      <w:proofErr w:type="spellEnd"/>
+      <w:r>
+        <w:t>: 9000</w:t>
       </w:r>
     </w:p>
     <w:p>
@@ -17177,7 +17385,15 @@
         <w:spacing w:after="0"/>
       </w:pPr>
       <w:r>
-        <w:t>Partitioning: By detector_id for load balancing</w:t>
+        <w:t xml:space="preserve">Partitioning: By </w:t>
+      </w:r>
+      <w:proofErr w:type="spellStart"/>
+      <w:r>
+        <w:t>detector_id</w:t>
+      </w:r>
+      <w:proofErr w:type="spellEnd"/>
+      <w:r>
+        <w:t xml:space="preserve"> for load balancing</w:t>
       </w:r>
     </w:p>
     <w:p>
@@ -17283,7 +17499,15 @@
         <w:spacing w:after="0"/>
       </w:pPr>
       <w:r>
-        <w:t>Retention: 90 days (7,776,000,000 ms)</w:t>
+        <w:t xml:space="preserve">Retention: 90 days (7,776,000,000 </w:t>
+      </w:r>
+      <w:proofErr w:type="spellStart"/>
+      <w:r>
+        <w:t>ms</w:t>
+      </w:r>
+      <w:proofErr w:type="spellEnd"/>
+      <w:r>
+        <w:t>)</w:t>
       </w:r>
     </w:p>
     <w:p>
@@ -17398,7 +17622,15 @@
         <w:t>kafka-topic-creation.sh</w:t>
       </w:r>
       <w:r>
-        <w:t xml:space="preserve"> contains the scripts to be run in bash in Ubuntu virtual box to create required kafka topics.</w:t>
+        <w:t xml:space="preserve"> contains the scripts to be run in bash in Ubuntu virtual box to create required </w:t>
+      </w:r>
+      <w:proofErr w:type="spellStart"/>
+      <w:r>
+        <w:t>kafka</w:t>
+      </w:r>
+      <w:proofErr w:type="spellEnd"/>
+      <w:r>
+        <w:t xml:space="preserve"> topics.</w:t>
       </w:r>
     </w:p>
     <w:p/>
@@ -17439,14 +17671,7 @@
           <w:b/>
           <w:bCs/>
         </w:rPr>
-        <w:t>Producer Architecture</w:t>
-      </w:r>
-      <w:r>
-        <w:rPr>
-          <w:b/>
-          <w:bCs/>
-        </w:rPr>
-        <w:t>:</w:t>
+        <w:t>Producer Architecture:</w:t>
       </w:r>
     </w:p>
     <w:p>
@@ -17585,7 +17810,15 @@
         <w:spacing w:after="0"/>
       </w:pPr>
       <w:r>
-        <w:t>Handles various boolean representations</w:t>
+        <w:t xml:space="preserve">Handles various </w:t>
+      </w:r>
+      <w:proofErr w:type="spellStart"/>
+      <w:r>
+        <w:t>boolean</w:t>
+      </w:r>
+      <w:proofErr w:type="spellEnd"/>
+      <w:r>
+        <w:t xml:space="preserve"> representations</w:t>
       </w:r>
     </w:p>
     <w:p>
@@ -17733,7 +17966,21 @@
         <w:rPr>
           <w:highlight w:val="yellow"/>
         </w:rPr>
-        <w:t>Monitors modified_date field changes</w:t>
+        <w:t xml:space="preserve">Monitors </w:t>
+      </w:r>
+      <w:proofErr w:type="spellStart"/>
+      <w:r>
+        <w:rPr>
+          <w:highlight w:val="yellow"/>
+        </w:rPr>
+        <w:t>modified_date</w:t>
+      </w:r>
+      <w:proofErr w:type="spellEnd"/>
+      <w:r>
+        <w:rPr>
+          <w:highlight w:val="yellow"/>
+        </w:rPr>
+        <w:t xml:space="preserve"> field changes</w:t>
       </w:r>
     </w:p>
     <w:p>
@@ -17975,7 +18222,15 @@
         <w:spacing w:after="0"/>
       </w:pPr>
       <w:r>
-        <w:t>Key: "date|hour|device_id"</w:t>
+        <w:t>Key: "</w:t>
+      </w:r>
+      <w:proofErr w:type="spellStart"/>
+      <w:r>
+        <w:t>date|hour|device_id</w:t>
+      </w:r>
+      <w:proofErr w:type="spellEnd"/>
+      <w:r>
+        <w:t>"</w:t>
       </w:r>
     </w:p>
     <w:p>
@@ -18674,8 +18929,13 @@
         <w:ind w:left="720"/>
       </w:pPr>
       <w:r>
-        <w:t>User: grafana</w:t>
-      </w:r>
+        <w:t xml:space="preserve">User: </w:t>
+      </w:r>
+      <w:proofErr w:type="spellStart"/>
+      <w:r>
+        <w:t>grafana</w:t>
+      </w:r>
+      <w:proofErr w:type="spellEnd"/>
     </w:p>
     <w:p>
       <w:pPr>
@@ -18683,8 +18943,13 @@
         <w:ind w:left="720"/>
       </w:pPr>
       <w:r>
-        <w:t>Password: grafana</w:t>
-      </w:r>
+        <w:t xml:space="preserve">Password: </w:t>
+      </w:r>
+      <w:proofErr w:type="spellStart"/>
+      <w:r>
+        <w:t>grafana</w:t>
+      </w:r>
+      <w:proofErr w:type="spellEnd"/>
     </w:p>
     <w:p>
       <w:pPr>
@@ -18730,9 +18995,11 @@
       <w:r>
         <w:t>‘</w:t>
       </w:r>
+      <w:proofErr w:type="spellStart"/>
       <w:r>
         <w:t>grafana</w:t>
       </w:r>
+      <w:proofErr w:type="spellEnd"/>
       <w:r>
         <w:t xml:space="preserve">’ </w:t>
       </w:r>
@@ -18795,19 +19062,34 @@
         <w:t>Select permission to</w:t>
       </w:r>
       <w:r>
-        <w:t xml:space="preserve"> hourly_sensor_metrics</w:t>
-      </w:r>
+        <w:t xml:space="preserve"> </w:t>
+      </w:r>
+      <w:proofErr w:type="spellStart"/>
+      <w:r>
+        <w:t>hourly_sensor_metrics</w:t>
+      </w:r>
+      <w:proofErr w:type="spellEnd"/>
       <w:r>
         <w:t xml:space="preserve">, </w:t>
       </w:r>
+      <w:proofErr w:type="spellStart"/>
       <w:r>
         <w:t>daily_peak_metrics</w:t>
       </w:r>
-      <w:r>
-        <w:t xml:space="preserve"> and s</w:t>
-      </w:r>
-      <w:r>
-        <w:t xml:space="preserve">ensor_availability_metrics </w:t>
+      <w:proofErr w:type="spellEnd"/>
+      <w:r>
+        <w:t xml:space="preserve"> and </w:t>
+      </w:r>
+      <w:proofErr w:type="spellStart"/>
+      <w:r>
+        <w:t>s</w:t>
+      </w:r>
+      <w:r>
+        <w:t>ensor_availability_metrics</w:t>
+      </w:r>
+      <w:proofErr w:type="spellEnd"/>
+      <w:r>
+        <w:t xml:space="preserve"> </w:t>
       </w:r>
       <w:r>
         <w:t>tables</w:t>
@@ -19452,61 +19734,61 @@
           <w:sz w:val="18"/>
           <w:szCs w:val="18"/>
         </w:rPr>
-        <w:t xml:space="preserve">  (a:User {name:'Dinuka', city:'Colombo', dob: date('1995-04-12')}),</w:t>
-      </w:r>
-    </w:p>
-    <w:p>
-      <w:pPr>
-        <w:spacing w:after="0"/>
+        <w:t xml:space="preserve">  (</w:t>
+      </w:r>
+      <w:proofErr w:type="spellStart"/>
+      <w:r>
         <w:rPr>
           <w:rFonts w:ascii="Consolas" w:hAnsi="Consolas"/>
           <w:sz w:val="18"/>
           <w:szCs w:val="18"/>
         </w:rPr>
-      </w:pPr>
+        <w:t>a:User</w:t>
+      </w:r>
+      <w:proofErr w:type="spellEnd"/>
       <w:r>
         <w:rPr>
           <w:rFonts w:ascii="Consolas" w:hAnsi="Consolas"/>
           <w:sz w:val="18"/>
           <w:szCs w:val="18"/>
         </w:rPr>
-        <w:t xml:space="preserve">  (b:User {name:'Kasun', city:'Kandy', dob: date('1996-08-23')}),</w:t>
-      </w:r>
-    </w:p>
-    <w:p>
-      <w:pPr>
-        <w:spacing w:after="0"/>
+        <w:t xml:space="preserve"> {name:'</w:t>
+      </w:r>
+      <w:proofErr w:type="spellStart"/>
+      <w:r>
         <w:rPr>
           <w:rFonts w:ascii="Consolas" w:hAnsi="Consolas"/>
           <w:sz w:val="18"/>
           <w:szCs w:val="18"/>
         </w:rPr>
-      </w:pPr>
+        <w:t>Dinuka</w:t>
+      </w:r>
+      <w:proofErr w:type="spellEnd"/>
       <w:r>
         <w:rPr>
           <w:rFonts w:ascii="Consolas" w:hAnsi="Consolas"/>
           <w:sz w:val="18"/>
           <w:szCs w:val="18"/>
         </w:rPr>
-        <w:t xml:space="preserve">  (c:User {name:'Rashmi', city:'Galle', dob: date('1997-03-15')}),</w:t>
-      </w:r>
-    </w:p>
-    <w:p>
-      <w:pPr>
-        <w:spacing w:after="0"/>
+        <w:t xml:space="preserve">', </w:t>
+      </w:r>
+      <w:proofErr w:type="spellStart"/>
+      <w:r>
         <w:rPr>
           <w:rFonts w:ascii="Consolas" w:hAnsi="Consolas"/>
           <w:sz w:val="18"/>
           <w:szCs w:val="18"/>
         </w:rPr>
-      </w:pPr>
+        <w:t>city:'Colombo</w:t>
+      </w:r>
+      <w:proofErr w:type="spellEnd"/>
       <w:r>
         <w:rPr>
           <w:rFonts w:ascii="Consolas" w:hAnsi="Consolas"/>
           <w:sz w:val="18"/>
           <w:szCs w:val="18"/>
         </w:rPr>
-        <w:t xml:space="preserve">  (d:User {name:'Tharindu', city:'Negombo', dob: date('1994-11-05')}),</w:t>
+        <w:t>', dob: date('1995-04-12')}),</w:t>
       </w:r>
     </w:p>
     <w:p>
@@ -19524,61 +19806,61 @@
           <w:sz w:val="18"/>
           <w:szCs w:val="18"/>
         </w:rPr>
-        <w:t xml:space="preserve">  (e:User {name:'Ishara', city:'Matara', dob: date('1995-12-30')}),</w:t>
-      </w:r>
-    </w:p>
-    <w:p>
-      <w:pPr>
-        <w:spacing w:after="0"/>
+        <w:t xml:space="preserve">  (</w:t>
+      </w:r>
+      <w:proofErr w:type="spellStart"/>
+      <w:r>
         <w:rPr>
           <w:rFonts w:ascii="Consolas" w:hAnsi="Consolas"/>
           <w:sz w:val="18"/>
           <w:szCs w:val="18"/>
         </w:rPr>
-      </w:pPr>
+        <w:t>b:User</w:t>
+      </w:r>
+      <w:proofErr w:type="spellEnd"/>
       <w:r>
         <w:rPr>
           <w:rFonts w:ascii="Consolas" w:hAnsi="Consolas"/>
           <w:sz w:val="18"/>
           <w:szCs w:val="18"/>
         </w:rPr>
-        <w:t xml:space="preserve">  (f:User {name:'Nuwan', city:'Kurunegala', dob: date('1996-07-18')}),</w:t>
-      </w:r>
-    </w:p>
-    <w:p>
-      <w:pPr>
-        <w:spacing w:after="0"/>
+        <w:t xml:space="preserve"> {</w:t>
+      </w:r>
+      <w:proofErr w:type="spellStart"/>
+      <w:r>
         <w:rPr>
           <w:rFonts w:ascii="Consolas" w:hAnsi="Consolas"/>
           <w:sz w:val="18"/>
           <w:szCs w:val="18"/>
         </w:rPr>
-      </w:pPr>
+        <w:t>name:'Kasun</w:t>
+      </w:r>
+      <w:proofErr w:type="spellEnd"/>
       <w:r>
         <w:rPr>
           <w:rFonts w:ascii="Consolas" w:hAnsi="Consolas"/>
           <w:sz w:val="18"/>
           <w:szCs w:val="18"/>
         </w:rPr>
-        <w:t xml:space="preserve">  (g:User {name:'Sajith', city:'Colombo', dob: date('1993-09-14')}),</w:t>
-      </w:r>
-    </w:p>
-    <w:p>
-      <w:pPr>
-        <w:spacing w:after="0"/>
+        <w:t xml:space="preserve">', </w:t>
+      </w:r>
+      <w:proofErr w:type="spellStart"/>
+      <w:r>
         <w:rPr>
           <w:rFonts w:ascii="Consolas" w:hAnsi="Consolas"/>
           <w:sz w:val="18"/>
           <w:szCs w:val="18"/>
         </w:rPr>
-      </w:pPr>
+        <w:t>city:'Kandy</w:t>
+      </w:r>
+      <w:proofErr w:type="spellEnd"/>
       <w:r>
         <w:rPr>
           <w:rFonts w:ascii="Consolas" w:hAnsi="Consolas"/>
           <w:sz w:val="18"/>
           <w:szCs w:val="18"/>
         </w:rPr>
-        <w:t xml:space="preserve">  (h:User {name:'Amali', city:'Kandy', dob: date('1998-02-05')}),</w:t>
+        <w:t>', dob: date('1996-08-23')}),</w:t>
       </w:r>
     </w:p>
     <w:p>
@@ -19596,61 +19878,61 @@
           <w:sz w:val="18"/>
           <w:szCs w:val="18"/>
         </w:rPr>
-        <w:t xml:space="preserve">  (i:User {name:'Gayan', city:'Galle', dob: date('1995-08-12')}),</w:t>
-      </w:r>
-    </w:p>
-    <w:p>
-      <w:pPr>
-        <w:spacing w:after="0"/>
+        <w:t xml:space="preserve">  (</w:t>
+      </w:r>
+      <w:proofErr w:type="spellStart"/>
+      <w:r>
         <w:rPr>
           <w:rFonts w:ascii="Consolas" w:hAnsi="Consolas"/>
           <w:sz w:val="18"/>
           <w:szCs w:val="18"/>
         </w:rPr>
-      </w:pPr>
+        <w:t>c:User</w:t>
+      </w:r>
+      <w:proofErr w:type="spellEnd"/>
       <w:r>
         <w:rPr>
           <w:rFonts w:ascii="Consolas" w:hAnsi="Consolas"/>
           <w:sz w:val="18"/>
           <w:szCs w:val="18"/>
         </w:rPr>
-        <w:t xml:space="preserve">  (j:User {name:'Bimali', city:'Matara', dob: date('1997-01-20')}),</w:t>
-      </w:r>
-    </w:p>
-    <w:p>
-      <w:pPr>
-        <w:spacing w:after="0"/>
+        <w:t xml:space="preserve"> {</w:t>
+      </w:r>
+      <w:proofErr w:type="spellStart"/>
+      <w:r>
         <w:rPr>
           <w:rFonts w:ascii="Consolas" w:hAnsi="Consolas"/>
           <w:sz w:val="18"/>
           <w:szCs w:val="18"/>
         </w:rPr>
-      </w:pPr>
+        <w:t>name:'Rashmi</w:t>
+      </w:r>
+      <w:proofErr w:type="spellEnd"/>
       <w:r>
         <w:rPr>
           <w:rFonts w:ascii="Consolas" w:hAnsi="Consolas"/>
           <w:sz w:val="18"/>
           <w:szCs w:val="18"/>
         </w:rPr>
-        <w:t xml:space="preserve">  (k:User {name:'Chathura', city:'Negombo', dob: date('1994-10-11')}),</w:t>
-      </w:r>
-    </w:p>
-    <w:p>
-      <w:pPr>
-        <w:spacing w:after="0"/>
+        <w:t xml:space="preserve">', </w:t>
+      </w:r>
+      <w:proofErr w:type="spellStart"/>
+      <w:r>
         <w:rPr>
           <w:rFonts w:ascii="Consolas" w:hAnsi="Consolas"/>
           <w:sz w:val="18"/>
           <w:szCs w:val="18"/>
         </w:rPr>
-      </w:pPr>
+        <w:t>city:'Galle</w:t>
+      </w:r>
+      <w:proofErr w:type="spellEnd"/>
       <w:r>
         <w:rPr>
           <w:rFonts w:ascii="Consolas" w:hAnsi="Consolas"/>
           <w:sz w:val="18"/>
           <w:szCs w:val="18"/>
         </w:rPr>
-        <w:t xml:space="preserve">  (l:User {name:'Dilani', city:'Kurunegala', dob: date('1996-05-22')}),</w:t>
+        <w:t>', dob: date('1997-03-15')}),</w:t>
       </w:r>
     </w:p>
     <w:p>
@@ -19668,61 +19950,61 @@
           <w:sz w:val="18"/>
           <w:szCs w:val="18"/>
         </w:rPr>
-        <w:t xml:space="preserve">  (m:User {name:'Ruwan', city:'Colombo', dob: date('1995-04-30')}),</w:t>
-      </w:r>
-    </w:p>
-    <w:p>
-      <w:pPr>
-        <w:spacing w:after="0"/>
+        <w:t xml:space="preserve">  (</w:t>
+      </w:r>
+      <w:proofErr w:type="spellStart"/>
+      <w:r>
         <w:rPr>
           <w:rFonts w:ascii="Consolas" w:hAnsi="Consolas"/>
           <w:sz w:val="18"/>
           <w:szCs w:val="18"/>
         </w:rPr>
-      </w:pPr>
+        <w:t>d:User</w:t>
+      </w:r>
+      <w:proofErr w:type="spellEnd"/>
       <w:r>
         <w:rPr>
           <w:rFonts w:ascii="Consolas" w:hAnsi="Consolas"/>
           <w:sz w:val="18"/>
           <w:szCs w:val="18"/>
         </w:rPr>
-        <w:t xml:space="preserve">  (n:User {name:'Kavindu', city:'Kandy', dob: date('1996-06-15')}),</w:t>
-      </w:r>
-    </w:p>
-    <w:p>
-      <w:pPr>
-        <w:spacing w:after="0"/>
+        <w:t xml:space="preserve"> {</w:t>
+      </w:r>
+      <w:proofErr w:type="spellStart"/>
+      <w:r>
         <w:rPr>
           <w:rFonts w:ascii="Consolas" w:hAnsi="Consolas"/>
           <w:sz w:val="18"/>
           <w:szCs w:val="18"/>
         </w:rPr>
-      </w:pPr>
+        <w:t>name:'Tharindu</w:t>
+      </w:r>
+      <w:proofErr w:type="spellEnd"/>
       <w:r>
         <w:rPr>
           <w:rFonts w:ascii="Consolas" w:hAnsi="Consolas"/>
           <w:sz w:val="18"/>
           <w:szCs w:val="18"/>
         </w:rPr>
-        <w:t xml:space="preserve">  (o:User {name:'Menaka', city:'Galle', dob: date('1995-07-09')}),</w:t>
-      </w:r>
-    </w:p>
-    <w:p>
-      <w:pPr>
-        <w:spacing w:after="0"/>
+        <w:t xml:space="preserve">', </w:t>
+      </w:r>
+      <w:proofErr w:type="spellStart"/>
+      <w:r>
         <w:rPr>
           <w:rFonts w:ascii="Consolas" w:hAnsi="Consolas"/>
           <w:sz w:val="18"/>
           <w:szCs w:val="18"/>
         </w:rPr>
-      </w:pPr>
+        <w:t>city:'Negombo</w:t>
+      </w:r>
+      <w:proofErr w:type="spellEnd"/>
       <w:r>
         <w:rPr>
           <w:rFonts w:ascii="Consolas" w:hAnsi="Consolas"/>
           <w:sz w:val="18"/>
           <w:szCs w:val="18"/>
         </w:rPr>
-        <w:t xml:space="preserve">  (p:User {name:'Prasanna', city:'Matara', dob: date('1993-12-03')}),</w:t>
+        <w:t>', dob: date('1994-11-05')}),</w:t>
       </w:r>
     </w:p>
     <w:p>
@@ -19740,61 +20022,61 @@
           <w:sz w:val="18"/>
           <w:szCs w:val="18"/>
         </w:rPr>
-        <w:t xml:space="preserve">  (q:User {name:'Nadeesha', city:'Colombo', dob: date('1998-03-18')}),</w:t>
-      </w:r>
-    </w:p>
-    <w:p>
-      <w:pPr>
-        <w:spacing w:after="0"/>
+        <w:t xml:space="preserve">  (</w:t>
+      </w:r>
+      <w:proofErr w:type="spellStart"/>
+      <w:r>
         <w:rPr>
           <w:rFonts w:ascii="Consolas" w:hAnsi="Consolas"/>
           <w:sz w:val="18"/>
           <w:szCs w:val="18"/>
         </w:rPr>
-      </w:pPr>
+        <w:t>e:User</w:t>
+      </w:r>
+      <w:proofErr w:type="spellEnd"/>
       <w:r>
         <w:rPr>
           <w:rFonts w:ascii="Consolas" w:hAnsi="Consolas"/>
           <w:sz w:val="18"/>
           <w:szCs w:val="18"/>
         </w:rPr>
-        <w:t xml:space="preserve">  (r:User {name:'Upeksha', city:'Negombo', dob: date('1997-08-25')}),</w:t>
-      </w:r>
-    </w:p>
-    <w:p>
-      <w:pPr>
-        <w:spacing w:after="0"/>
+        <w:t xml:space="preserve"> {</w:t>
+      </w:r>
+      <w:proofErr w:type="spellStart"/>
+      <w:r>
         <w:rPr>
           <w:rFonts w:ascii="Consolas" w:hAnsi="Consolas"/>
           <w:sz w:val="18"/>
           <w:szCs w:val="18"/>
         </w:rPr>
-      </w:pPr>
+        <w:t>name:'Ishara</w:t>
+      </w:r>
+      <w:proofErr w:type="spellEnd"/>
       <w:r>
         <w:rPr>
           <w:rFonts w:ascii="Consolas" w:hAnsi="Consolas"/>
           <w:sz w:val="18"/>
           <w:szCs w:val="18"/>
         </w:rPr>
-        <w:t xml:space="preserve">  (s:User {name:'Yasiru', city:'Kandy', dob: date('1994-05-16')}),</w:t>
-      </w:r>
-    </w:p>
-    <w:p>
-      <w:pPr>
-        <w:spacing w:after="0"/>
+        <w:t xml:space="preserve">', </w:t>
+      </w:r>
+      <w:proofErr w:type="spellStart"/>
+      <w:r>
         <w:rPr>
           <w:rFonts w:ascii="Consolas" w:hAnsi="Consolas"/>
           <w:sz w:val="18"/>
           <w:szCs w:val="18"/>
         </w:rPr>
-      </w:pPr>
+        <w:t>city:'Matara</w:t>
+      </w:r>
+      <w:proofErr w:type="spellEnd"/>
       <w:r>
         <w:rPr>
           <w:rFonts w:ascii="Consolas" w:hAnsi="Consolas"/>
           <w:sz w:val="18"/>
           <w:szCs w:val="18"/>
         </w:rPr>
-        <w:t xml:space="preserve">  (t:User {name:'Thilini', city:'Galle', dob: date('1996-11-21')}),</w:t>
+        <w:t>', dob: date('1995-12-30')}),</w:t>
       </w:r>
     </w:p>
     <w:p>
@@ -19806,69 +20088,67 @@
           <w:szCs w:val="18"/>
         </w:rPr>
       </w:pPr>
-    </w:p>
-    <w:p>
-      <w:pPr>
-        <w:spacing w:after="0"/>
+      <w:r>
         <w:rPr>
           <w:rFonts w:ascii="Consolas" w:hAnsi="Consolas"/>
           <w:sz w:val="18"/>
           <w:szCs w:val="18"/>
         </w:rPr>
-      </w:pPr>
+        <w:t xml:space="preserve">  (</w:t>
+      </w:r>
+      <w:proofErr w:type="spellStart"/>
       <w:r>
         <w:rPr>
           <w:rFonts w:ascii="Consolas" w:hAnsi="Consolas"/>
           <w:sz w:val="18"/>
           <w:szCs w:val="18"/>
         </w:rPr>
-        <w:t>// FOLLOWS relationships (directed)</w:t>
-      </w:r>
-    </w:p>
-    <w:p>
-      <w:pPr>
-        <w:spacing w:after="0"/>
+        <w:t>f:User</w:t>
+      </w:r>
+      <w:proofErr w:type="spellEnd"/>
+      <w:r>
         <w:rPr>
           <w:rFonts w:ascii="Consolas" w:hAnsi="Consolas"/>
           <w:sz w:val="18"/>
           <w:szCs w:val="18"/>
         </w:rPr>
-      </w:pPr>
-    </w:p>
-    <w:p>
-      <w:pPr>
-        <w:spacing w:after="0"/>
+        <w:t xml:space="preserve"> {</w:t>
+      </w:r>
+      <w:proofErr w:type="spellStart"/>
+      <w:r>
         <w:rPr>
           <w:rFonts w:ascii="Consolas" w:hAnsi="Consolas"/>
           <w:sz w:val="18"/>
           <w:szCs w:val="18"/>
         </w:rPr>
-      </w:pPr>
+        <w:t>name:'Nuwan</w:t>
+      </w:r>
+      <w:proofErr w:type="spellEnd"/>
       <w:r>
         <w:rPr>
           <w:rFonts w:ascii="Consolas" w:hAnsi="Consolas"/>
           <w:sz w:val="18"/>
           <w:szCs w:val="18"/>
         </w:rPr>
-        <w:t xml:space="preserve">  (a)-[:FOLLOWS]-&gt;(b),</w:t>
-      </w:r>
-    </w:p>
-    <w:p>
-      <w:pPr>
-        <w:spacing w:after="0"/>
+        <w:t xml:space="preserve">', </w:t>
+      </w:r>
+      <w:proofErr w:type="spellStart"/>
+      <w:r>
         <w:rPr>
           <w:rFonts w:ascii="Consolas" w:hAnsi="Consolas"/>
           <w:sz w:val="18"/>
           <w:szCs w:val="18"/>
         </w:rPr>
-      </w:pPr>
+        <w:t>city:'Kurunegala</w:t>
+      </w:r>
+      <w:proofErr w:type="spellEnd"/>
       <w:r>
         <w:rPr>
           <w:rFonts w:ascii="Consolas" w:hAnsi="Consolas"/>
           <w:sz w:val="18"/>
           <w:szCs w:val="18"/>
         </w:rPr>
-        <w:t xml:space="preserve">  (a)-[:FOLLOWS]-&gt;(c),</w:t>
+        <w:t>', dob: date('1996-07-18')}),</w:t>
       </w:r>
     </w:p>
     <w:p>
@@ -19886,61 +20166,61 @@
           <w:sz w:val="18"/>
           <w:szCs w:val="18"/>
         </w:rPr>
-        <w:t xml:space="preserve">  (a)-[:FOLLOWS]-&gt;(d),</w:t>
-      </w:r>
-    </w:p>
-    <w:p>
-      <w:pPr>
-        <w:spacing w:after="0"/>
+        <w:t xml:space="preserve">  (</w:t>
+      </w:r>
+      <w:proofErr w:type="spellStart"/>
+      <w:r>
         <w:rPr>
           <w:rFonts w:ascii="Consolas" w:hAnsi="Consolas"/>
           <w:sz w:val="18"/>
           <w:szCs w:val="18"/>
         </w:rPr>
-      </w:pPr>
+        <w:t>g:User</w:t>
+      </w:r>
+      <w:proofErr w:type="spellEnd"/>
       <w:r>
         <w:rPr>
           <w:rFonts w:ascii="Consolas" w:hAnsi="Consolas"/>
           <w:sz w:val="18"/>
           <w:szCs w:val="18"/>
         </w:rPr>
-        <w:t xml:space="preserve">  (b)-[:FOLLOWS]-&gt;(a),</w:t>
-      </w:r>
-    </w:p>
-    <w:p>
-      <w:pPr>
-        <w:spacing w:after="0"/>
+        <w:t xml:space="preserve"> {</w:t>
+      </w:r>
+      <w:proofErr w:type="spellStart"/>
+      <w:r>
         <w:rPr>
           <w:rFonts w:ascii="Consolas" w:hAnsi="Consolas"/>
           <w:sz w:val="18"/>
           <w:szCs w:val="18"/>
         </w:rPr>
-      </w:pPr>
+        <w:t>name:'Sajith</w:t>
+      </w:r>
+      <w:proofErr w:type="spellEnd"/>
       <w:r>
         <w:rPr>
           <w:rFonts w:ascii="Consolas" w:hAnsi="Consolas"/>
           <w:sz w:val="18"/>
           <w:szCs w:val="18"/>
         </w:rPr>
-        <w:t xml:space="preserve">  (b)-[:FOLLOWS]-&gt;(e),</w:t>
-      </w:r>
-    </w:p>
-    <w:p>
-      <w:pPr>
-        <w:spacing w:after="0"/>
+        <w:t xml:space="preserve">', </w:t>
+      </w:r>
+      <w:proofErr w:type="spellStart"/>
+      <w:r>
         <w:rPr>
           <w:rFonts w:ascii="Consolas" w:hAnsi="Consolas"/>
           <w:sz w:val="18"/>
           <w:szCs w:val="18"/>
         </w:rPr>
-      </w:pPr>
+        <w:t>city:'Colombo</w:t>
+      </w:r>
+      <w:proofErr w:type="spellEnd"/>
       <w:r>
         <w:rPr>
           <w:rFonts w:ascii="Consolas" w:hAnsi="Consolas"/>
           <w:sz w:val="18"/>
           <w:szCs w:val="18"/>
         </w:rPr>
-        <w:t xml:space="preserve">  (b)-[:FOLLOWS]-&gt;(f),</w:t>
+        <w:t>', dob: date('1993-09-14')}),</w:t>
       </w:r>
     </w:p>
     <w:p>
@@ -19958,61 +20238,61 @@
           <w:sz w:val="18"/>
           <w:szCs w:val="18"/>
         </w:rPr>
-        <w:t xml:space="preserve">  (c)-[:FOLLOWS]-&gt;(a),</w:t>
-      </w:r>
-    </w:p>
-    <w:p>
-      <w:pPr>
-        <w:spacing w:after="0"/>
+        <w:t xml:space="preserve">  (</w:t>
+      </w:r>
+      <w:proofErr w:type="spellStart"/>
+      <w:r>
         <w:rPr>
           <w:rFonts w:ascii="Consolas" w:hAnsi="Consolas"/>
           <w:sz w:val="18"/>
           <w:szCs w:val="18"/>
         </w:rPr>
-      </w:pPr>
+        <w:t>h:User</w:t>
+      </w:r>
+      <w:proofErr w:type="spellEnd"/>
       <w:r>
         <w:rPr>
           <w:rFonts w:ascii="Consolas" w:hAnsi="Consolas"/>
           <w:sz w:val="18"/>
           <w:szCs w:val="18"/>
         </w:rPr>
-        <w:t xml:space="preserve">  (c)-[:FOLLOWS]-&gt;(h),</w:t>
-      </w:r>
-    </w:p>
-    <w:p>
-      <w:pPr>
-        <w:spacing w:after="0"/>
+        <w:t xml:space="preserve"> {</w:t>
+      </w:r>
+      <w:proofErr w:type="spellStart"/>
+      <w:r>
         <w:rPr>
           <w:rFonts w:ascii="Consolas" w:hAnsi="Consolas"/>
           <w:sz w:val="18"/>
           <w:szCs w:val="18"/>
         </w:rPr>
-      </w:pPr>
+        <w:t>name:'Amali</w:t>
+      </w:r>
+      <w:proofErr w:type="spellEnd"/>
       <w:r>
         <w:rPr>
           <w:rFonts w:ascii="Consolas" w:hAnsi="Consolas"/>
           <w:sz w:val="18"/>
           <w:szCs w:val="18"/>
         </w:rPr>
-        <w:t xml:space="preserve">  (c)-[:FOLLOWS]-&gt;(j),</w:t>
-      </w:r>
-    </w:p>
-    <w:p>
-      <w:pPr>
-        <w:spacing w:after="0"/>
+        <w:t xml:space="preserve">', </w:t>
+      </w:r>
+      <w:proofErr w:type="spellStart"/>
+      <w:r>
         <w:rPr>
           <w:rFonts w:ascii="Consolas" w:hAnsi="Consolas"/>
           <w:sz w:val="18"/>
           <w:szCs w:val="18"/>
         </w:rPr>
-      </w:pPr>
+        <w:t>city:'Kandy</w:t>
+      </w:r>
+      <w:proofErr w:type="spellEnd"/>
       <w:r>
         <w:rPr>
           <w:rFonts w:ascii="Consolas" w:hAnsi="Consolas"/>
           <w:sz w:val="18"/>
           <w:szCs w:val="18"/>
         </w:rPr>
-        <w:t xml:space="preserve">  (d)-[:FOLLOWS]-&gt;(f),</w:t>
+        <w:t>', dob: date('1998-02-05')}),</w:t>
       </w:r>
     </w:p>
     <w:p>
@@ -20030,61 +20310,61 @@
           <w:sz w:val="18"/>
           <w:szCs w:val="18"/>
         </w:rPr>
-        <w:t xml:space="preserve">  (d)-[:FOLLOWS]-&gt;(g),</w:t>
-      </w:r>
-    </w:p>
-    <w:p>
-      <w:pPr>
-        <w:spacing w:after="0"/>
+        <w:t xml:space="preserve">  (</w:t>
+      </w:r>
+      <w:proofErr w:type="spellStart"/>
+      <w:r>
         <w:rPr>
           <w:rFonts w:ascii="Consolas" w:hAnsi="Consolas"/>
           <w:sz w:val="18"/>
           <w:szCs w:val="18"/>
         </w:rPr>
-      </w:pPr>
+        <w:t>i:User</w:t>
+      </w:r>
+      <w:proofErr w:type="spellEnd"/>
       <w:r>
         <w:rPr>
           <w:rFonts w:ascii="Consolas" w:hAnsi="Consolas"/>
           <w:sz w:val="18"/>
           <w:szCs w:val="18"/>
         </w:rPr>
-        <w:t xml:space="preserve">  (e)-[:FOLLOWS]-&gt;(c),</w:t>
-      </w:r>
-    </w:p>
-    <w:p>
-      <w:pPr>
-        <w:spacing w:after="0"/>
+        <w:t xml:space="preserve"> {</w:t>
+      </w:r>
+      <w:proofErr w:type="spellStart"/>
+      <w:r>
         <w:rPr>
           <w:rFonts w:ascii="Consolas" w:hAnsi="Consolas"/>
           <w:sz w:val="18"/>
           <w:szCs w:val="18"/>
         </w:rPr>
-      </w:pPr>
+        <w:t>name:'Gayan</w:t>
+      </w:r>
+      <w:proofErr w:type="spellEnd"/>
       <w:r>
         <w:rPr>
           <w:rFonts w:ascii="Consolas" w:hAnsi="Consolas"/>
           <w:sz w:val="18"/>
           <w:szCs w:val="18"/>
         </w:rPr>
-        <w:t xml:space="preserve">  (e)-[:FOLLOWS]-&gt;(i),</w:t>
-      </w:r>
-    </w:p>
-    <w:p>
-      <w:pPr>
-        <w:spacing w:after="0"/>
+        <w:t xml:space="preserve">', </w:t>
+      </w:r>
+      <w:proofErr w:type="spellStart"/>
+      <w:r>
         <w:rPr>
           <w:rFonts w:ascii="Consolas" w:hAnsi="Consolas"/>
           <w:sz w:val="18"/>
           <w:szCs w:val="18"/>
         </w:rPr>
-      </w:pPr>
+        <w:t>city:'Galle</w:t>
+      </w:r>
+      <w:proofErr w:type="spellEnd"/>
       <w:r>
         <w:rPr>
           <w:rFonts w:ascii="Consolas" w:hAnsi="Consolas"/>
           <w:sz w:val="18"/>
           <w:szCs w:val="18"/>
         </w:rPr>
-        <w:t xml:space="preserve">  (f)-[:FOLLOWS]-&gt;(j),</w:t>
+        <w:t>', dob: date('1995-08-12')}),</w:t>
       </w:r>
     </w:p>
     <w:p>
@@ -20102,61 +20382,61 @@
           <w:sz w:val="18"/>
           <w:szCs w:val="18"/>
         </w:rPr>
-        <w:t xml:space="preserve">  (f)-[:FOLLOWS]-&gt;(k),</w:t>
-      </w:r>
-    </w:p>
-    <w:p>
-      <w:pPr>
-        <w:spacing w:after="0"/>
+        <w:t xml:space="preserve">  (</w:t>
+      </w:r>
+      <w:proofErr w:type="spellStart"/>
+      <w:r>
         <w:rPr>
           <w:rFonts w:ascii="Consolas" w:hAnsi="Consolas"/>
           <w:sz w:val="18"/>
           <w:szCs w:val="18"/>
         </w:rPr>
-      </w:pPr>
+        <w:t>j:User</w:t>
+      </w:r>
+      <w:proofErr w:type="spellEnd"/>
       <w:r>
         <w:rPr>
           <w:rFonts w:ascii="Consolas" w:hAnsi="Consolas"/>
           <w:sz w:val="18"/>
           <w:szCs w:val="18"/>
         </w:rPr>
-        <w:t xml:space="preserve">  (g)-[:FOLLOWS]-&gt;(l),</w:t>
-      </w:r>
-    </w:p>
-    <w:p>
-      <w:pPr>
-        <w:spacing w:after="0"/>
+        <w:t xml:space="preserve"> {</w:t>
+      </w:r>
+      <w:proofErr w:type="spellStart"/>
+      <w:r>
         <w:rPr>
           <w:rFonts w:ascii="Consolas" w:hAnsi="Consolas"/>
           <w:sz w:val="18"/>
           <w:szCs w:val="18"/>
         </w:rPr>
-      </w:pPr>
+        <w:t>name:'Bimali</w:t>
+      </w:r>
+      <w:proofErr w:type="spellEnd"/>
       <w:r>
         <w:rPr>
           <w:rFonts w:ascii="Consolas" w:hAnsi="Consolas"/>
           <w:sz w:val="18"/>
           <w:szCs w:val="18"/>
         </w:rPr>
-        <w:t xml:space="preserve">  (h)-[:FOLLOWS]-&gt;(m),</w:t>
-      </w:r>
-    </w:p>
-    <w:p>
-      <w:pPr>
-        <w:spacing w:after="0"/>
+        <w:t xml:space="preserve">', </w:t>
+      </w:r>
+      <w:proofErr w:type="spellStart"/>
+      <w:r>
         <w:rPr>
           <w:rFonts w:ascii="Consolas" w:hAnsi="Consolas"/>
           <w:sz w:val="18"/>
           <w:szCs w:val="18"/>
         </w:rPr>
-      </w:pPr>
+        <w:t>city:'Matara</w:t>
+      </w:r>
+      <w:proofErr w:type="spellEnd"/>
       <w:r>
         <w:rPr>
           <w:rFonts w:ascii="Consolas" w:hAnsi="Consolas"/>
           <w:sz w:val="18"/>
           <w:szCs w:val="18"/>
         </w:rPr>
-        <w:t xml:space="preserve">  (i)-[:FOLLOWS]-&gt;(b),</w:t>
+        <w:t>', dob: date('1997-01-20')}),</w:t>
       </w:r>
     </w:p>
     <w:p>
@@ -20174,61 +20454,61 @@
           <w:sz w:val="18"/>
           <w:szCs w:val="18"/>
         </w:rPr>
-        <w:t xml:space="preserve">  (i)-[:FOLLOWS]-&gt;(c),</w:t>
-      </w:r>
-    </w:p>
-    <w:p>
-      <w:pPr>
-        <w:spacing w:after="0"/>
+        <w:t xml:space="preserve">  (</w:t>
+      </w:r>
+      <w:proofErr w:type="spellStart"/>
+      <w:r>
         <w:rPr>
           <w:rFonts w:ascii="Consolas" w:hAnsi="Consolas"/>
           <w:sz w:val="18"/>
           <w:szCs w:val="18"/>
         </w:rPr>
-      </w:pPr>
+        <w:t>k:User</w:t>
+      </w:r>
+      <w:proofErr w:type="spellEnd"/>
       <w:r>
         <w:rPr>
           <w:rFonts w:ascii="Consolas" w:hAnsi="Consolas"/>
           <w:sz w:val="18"/>
           <w:szCs w:val="18"/>
         </w:rPr>
-        <w:t xml:space="preserve">  (j)-[:FOLLOWS]-&gt;(a),</w:t>
-      </w:r>
-    </w:p>
-    <w:p>
-      <w:pPr>
-        <w:spacing w:after="0"/>
+        <w:t xml:space="preserve"> {</w:t>
+      </w:r>
+      <w:proofErr w:type="spellStart"/>
+      <w:r>
         <w:rPr>
           <w:rFonts w:ascii="Consolas" w:hAnsi="Consolas"/>
           <w:sz w:val="18"/>
           <w:szCs w:val="18"/>
         </w:rPr>
-      </w:pPr>
+        <w:t>name:'Chathura</w:t>
+      </w:r>
+      <w:proofErr w:type="spellEnd"/>
       <w:r>
         <w:rPr>
           <w:rFonts w:ascii="Consolas" w:hAnsi="Consolas"/>
           <w:sz w:val="18"/>
           <w:szCs w:val="18"/>
         </w:rPr>
-        <w:t xml:space="preserve">  (j)-[:FOLLOWS]-&gt;(n),</w:t>
-      </w:r>
-    </w:p>
-    <w:p>
-      <w:pPr>
-        <w:spacing w:after="0"/>
+        <w:t xml:space="preserve">', </w:t>
+      </w:r>
+      <w:proofErr w:type="spellStart"/>
+      <w:r>
         <w:rPr>
           <w:rFonts w:ascii="Consolas" w:hAnsi="Consolas"/>
           <w:sz w:val="18"/>
           <w:szCs w:val="18"/>
         </w:rPr>
-      </w:pPr>
+        <w:t>city:'Negombo</w:t>
+      </w:r>
+      <w:proofErr w:type="spellEnd"/>
       <w:r>
         <w:rPr>
           <w:rFonts w:ascii="Consolas" w:hAnsi="Consolas"/>
           <w:sz w:val="18"/>
           <w:szCs w:val="18"/>
         </w:rPr>
-        <w:t xml:space="preserve">  (k)-[:FOLLOWS]-&gt;(o),</w:t>
+        <w:t>', dob: date('1994-10-11')}),</w:t>
       </w:r>
     </w:p>
     <w:p>
@@ -20246,62 +20526,61 @@
           <w:sz w:val="18"/>
           <w:szCs w:val="18"/>
         </w:rPr>
-        <w:t xml:space="preserve">  (l)-[:FOLLOWS]-&gt;(p),</w:t>
-      </w:r>
-    </w:p>
-    <w:p>
-      <w:pPr>
-        <w:spacing w:after="0"/>
+        <w:t xml:space="preserve">  (</w:t>
+      </w:r>
+      <w:proofErr w:type="spellStart"/>
+      <w:r>
         <w:rPr>
           <w:rFonts w:ascii="Consolas" w:hAnsi="Consolas"/>
           <w:sz w:val="18"/>
           <w:szCs w:val="18"/>
         </w:rPr>
-      </w:pPr>
+        <w:t>l:User</w:t>
+      </w:r>
+      <w:proofErr w:type="spellEnd"/>
       <w:r>
         <w:rPr>
           <w:rFonts w:ascii="Consolas" w:hAnsi="Consolas"/>
           <w:sz w:val="18"/>
           <w:szCs w:val="18"/>
         </w:rPr>
-        <w:lastRenderedPageBreak/>
-        <w:t xml:space="preserve">  (m)-[:FOLLOWS]-&gt;(q),</w:t>
-      </w:r>
-    </w:p>
-    <w:p>
-      <w:pPr>
-        <w:spacing w:after="0"/>
+        <w:t xml:space="preserve"> {</w:t>
+      </w:r>
+      <w:proofErr w:type="spellStart"/>
+      <w:r>
         <w:rPr>
           <w:rFonts w:ascii="Consolas" w:hAnsi="Consolas"/>
           <w:sz w:val="18"/>
           <w:szCs w:val="18"/>
         </w:rPr>
-      </w:pPr>
+        <w:t>name:'Dilani</w:t>
+      </w:r>
+      <w:proofErr w:type="spellEnd"/>
       <w:r>
         <w:rPr>
           <w:rFonts w:ascii="Consolas" w:hAnsi="Consolas"/>
           <w:sz w:val="18"/>
           <w:szCs w:val="18"/>
         </w:rPr>
-        <w:t xml:space="preserve">  (n)-[:FOLLOWS]-&gt;(r),</w:t>
-      </w:r>
-    </w:p>
-    <w:p>
-      <w:pPr>
-        <w:spacing w:after="0"/>
+        <w:t xml:space="preserve">', </w:t>
+      </w:r>
+      <w:proofErr w:type="spellStart"/>
+      <w:r>
         <w:rPr>
           <w:rFonts w:ascii="Consolas" w:hAnsi="Consolas"/>
           <w:sz w:val="18"/>
           <w:szCs w:val="18"/>
         </w:rPr>
-      </w:pPr>
+        <w:t>city:'Kurunegala</w:t>
+      </w:r>
+      <w:proofErr w:type="spellEnd"/>
       <w:r>
         <w:rPr>
           <w:rFonts w:ascii="Consolas" w:hAnsi="Consolas"/>
           <w:sz w:val="18"/>
           <w:szCs w:val="18"/>
         </w:rPr>
-        <w:t xml:space="preserve">  (o)-[:FOLLOWS]-&gt;(s),</w:t>
+        <w:t>', dob: date('1996-05-22')}),</w:t>
       </w:r>
     </w:p>
     <w:p>
@@ -20319,61 +20598,61 @@
           <w:sz w:val="18"/>
           <w:szCs w:val="18"/>
         </w:rPr>
-        <w:t xml:space="preserve">  (p)-[:FOLLOWS]-&gt;(a),</w:t>
-      </w:r>
-    </w:p>
-    <w:p>
-      <w:pPr>
-        <w:spacing w:after="0"/>
+        <w:t xml:space="preserve">  (</w:t>
+      </w:r>
+      <w:proofErr w:type="spellStart"/>
+      <w:r>
         <w:rPr>
           <w:rFonts w:ascii="Consolas" w:hAnsi="Consolas"/>
           <w:sz w:val="18"/>
           <w:szCs w:val="18"/>
         </w:rPr>
-      </w:pPr>
+        <w:t>m:User</w:t>
+      </w:r>
+      <w:proofErr w:type="spellEnd"/>
       <w:r>
         <w:rPr>
           <w:rFonts w:ascii="Consolas" w:hAnsi="Consolas"/>
           <w:sz w:val="18"/>
           <w:szCs w:val="18"/>
         </w:rPr>
-        <w:t xml:space="preserve">  (p)-[:FOLLOWS]-&gt;(t),</w:t>
-      </w:r>
-    </w:p>
-    <w:p>
-      <w:pPr>
-        <w:spacing w:after="0"/>
+        <w:t xml:space="preserve"> {</w:t>
+      </w:r>
+      <w:proofErr w:type="spellStart"/>
+      <w:r>
         <w:rPr>
           <w:rFonts w:ascii="Consolas" w:hAnsi="Consolas"/>
           <w:sz w:val="18"/>
           <w:szCs w:val="18"/>
         </w:rPr>
-      </w:pPr>
+        <w:t>name:'Ruwan</w:t>
+      </w:r>
+      <w:proofErr w:type="spellEnd"/>
       <w:r>
         <w:rPr>
           <w:rFonts w:ascii="Consolas" w:hAnsi="Consolas"/>
           <w:sz w:val="18"/>
           <w:szCs w:val="18"/>
         </w:rPr>
-        <w:t xml:space="preserve">  (q)-[:FOLLOWS]-&gt;(a),</w:t>
-      </w:r>
-    </w:p>
-    <w:p>
-      <w:pPr>
-        <w:spacing w:after="0"/>
+        <w:t xml:space="preserve">', </w:t>
+      </w:r>
+      <w:proofErr w:type="spellStart"/>
+      <w:r>
         <w:rPr>
           <w:rFonts w:ascii="Consolas" w:hAnsi="Consolas"/>
           <w:sz w:val="18"/>
           <w:szCs w:val="18"/>
         </w:rPr>
-      </w:pPr>
+        <w:t>city:'Colombo</w:t>
+      </w:r>
+      <w:proofErr w:type="spellEnd"/>
       <w:r>
         <w:rPr>
           <w:rFonts w:ascii="Consolas" w:hAnsi="Consolas"/>
           <w:sz w:val="18"/>
           <w:szCs w:val="18"/>
         </w:rPr>
-        <w:t xml:space="preserve">  (r)-[:FOLLOWS]-&gt;(d),</w:t>
+        <w:t>', dob: date('1995-04-30')}),</w:t>
       </w:r>
     </w:p>
     <w:p>
@@ -20391,61 +20670,61 @@
           <w:sz w:val="18"/>
           <w:szCs w:val="18"/>
         </w:rPr>
-        <w:t xml:space="preserve">  (r)-[:FOLLOWS]-&gt;(g),</w:t>
-      </w:r>
-    </w:p>
-    <w:p>
-      <w:pPr>
-        <w:spacing w:after="0"/>
+        <w:t xml:space="preserve">  (</w:t>
+      </w:r>
+      <w:proofErr w:type="spellStart"/>
+      <w:r>
         <w:rPr>
           <w:rFonts w:ascii="Consolas" w:hAnsi="Consolas"/>
           <w:sz w:val="18"/>
           <w:szCs w:val="18"/>
         </w:rPr>
-      </w:pPr>
+        <w:t>n:User</w:t>
+      </w:r>
+      <w:proofErr w:type="spellEnd"/>
       <w:r>
         <w:rPr>
           <w:rFonts w:ascii="Consolas" w:hAnsi="Consolas"/>
           <w:sz w:val="18"/>
           <w:szCs w:val="18"/>
         </w:rPr>
-        <w:t xml:space="preserve">  (s)-[:FOLLOWS]-&gt;(h),</w:t>
-      </w:r>
-    </w:p>
-    <w:p>
-      <w:pPr>
-        <w:spacing w:after="0"/>
+        <w:t xml:space="preserve"> {name:'</w:t>
+      </w:r>
+      <w:proofErr w:type="spellStart"/>
+      <w:r>
         <w:rPr>
           <w:rFonts w:ascii="Consolas" w:hAnsi="Consolas"/>
           <w:sz w:val="18"/>
           <w:szCs w:val="18"/>
         </w:rPr>
-      </w:pPr>
+        <w:t>Kavindu</w:t>
+      </w:r>
+      <w:proofErr w:type="spellEnd"/>
       <w:r>
         <w:rPr>
           <w:rFonts w:ascii="Consolas" w:hAnsi="Consolas"/>
           <w:sz w:val="18"/>
           <w:szCs w:val="18"/>
         </w:rPr>
-        <w:t xml:space="preserve">  (s)-[:FOLLOWS]-&gt;(i),</w:t>
-      </w:r>
-    </w:p>
-    <w:p>
-      <w:pPr>
-        <w:spacing w:after="0"/>
+        <w:t xml:space="preserve">', </w:t>
+      </w:r>
+      <w:proofErr w:type="spellStart"/>
+      <w:r>
         <w:rPr>
           <w:rFonts w:ascii="Consolas" w:hAnsi="Consolas"/>
           <w:sz w:val="18"/>
           <w:szCs w:val="18"/>
         </w:rPr>
-      </w:pPr>
+        <w:t>city:'Kandy</w:t>
+      </w:r>
+      <w:proofErr w:type="spellEnd"/>
       <w:r>
         <w:rPr>
           <w:rFonts w:ascii="Consolas" w:hAnsi="Consolas"/>
           <w:sz w:val="18"/>
           <w:szCs w:val="18"/>
         </w:rPr>
-        <w:t xml:space="preserve">  (t)-[:FOLLOWS]-&gt;(b),</w:t>
+        <w:t>', dob: date('1996-06-15')}),</w:t>
       </w:r>
     </w:p>
     <w:p>
@@ -20463,135 +20742,133 @@
           <w:sz w:val="18"/>
           <w:szCs w:val="18"/>
         </w:rPr>
-        <w:t xml:space="preserve">  (t)-[:FOLLOWS]-&gt;(j),</w:t>
-      </w:r>
-    </w:p>
-    <w:p>
-      <w:pPr>
-        <w:spacing w:after="0"/>
+        <w:t xml:space="preserve">  (</w:t>
+      </w:r>
+      <w:proofErr w:type="spellStart"/>
+      <w:r>
         <w:rPr>
           <w:rFonts w:ascii="Consolas" w:hAnsi="Consolas"/>
           <w:sz w:val="18"/>
           <w:szCs w:val="18"/>
         </w:rPr>
-      </w:pPr>
+        <w:t>o:User</w:t>
+      </w:r>
+      <w:proofErr w:type="spellEnd"/>
       <w:r>
         <w:rPr>
           <w:rFonts w:ascii="Consolas" w:hAnsi="Consolas"/>
           <w:sz w:val="18"/>
           <w:szCs w:val="18"/>
         </w:rPr>
-        <w:t xml:space="preserve">  (t)-[:FOLLOWS]-&gt;(m),</w:t>
-      </w:r>
-    </w:p>
-    <w:p>
-      <w:pPr>
-        <w:spacing w:after="0"/>
+        <w:t xml:space="preserve"> {</w:t>
+      </w:r>
+      <w:proofErr w:type="spellStart"/>
+      <w:r>
         <w:rPr>
           <w:rFonts w:ascii="Consolas" w:hAnsi="Consolas"/>
           <w:sz w:val="18"/>
           <w:szCs w:val="18"/>
         </w:rPr>
-      </w:pPr>
+        <w:t>name:'Menaka</w:t>
+      </w:r>
+      <w:proofErr w:type="spellEnd"/>
       <w:r>
         <w:rPr>
           <w:rFonts w:ascii="Consolas" w:hAnsi="Consolas"/>
           <w:sz w:val="18"/>
           <w:szCs w:val="18"/>
         </w:rPr>
-        <w:t xml:space="preserve">  (n)-[:FOLLOWS]-&gt;(f),</w:t>
-      </w:r>
-    </w:p>
-    <w:p>
-      <w:pPr>
-        <w:spacing w:after="0"/>
+        <w:t xml:space="preserve">', </w:t>
+      </w:r>
+      <w:proofErr w:type="spellStart"/>
+      <w:r>
         <w:rPr>
           <w:rFonts w:ascii="Consolas" w:hAnsi="Consolas"/>
           <w:sz w:val="18"/>
           <w:szCs w:val="18"/>
         </w:rPr>
-      </w:pPr>
-    </w:p>
-    <w:p>
-      <w:pPr>
-        <w:spacing w:after="0"/>
+        <w:t>city:'Galle</w:t>
+      </w:r>
+      <w:proofErr w:type="spellEnd"/>
+      <w:r>
         <w:rPr>
           <w:rFonts w:ascii="Consolas" w:hAnsi="Consolas"/>
           <w:sz w:val="18"/>
           <w:szCs w:val="18"/>
         </w:rPr>
-      </w:pPr>
-      <w:r>
+        <w:t>', dob: date('1995-07-09')}),</w:t>
+      </w:r>
+    </w:p>
+    <w:p>
+      <w:pPr>
+        <w:spacing w:after="0"/>
         <w:rPr>
           <w:rFonts w:ascii="Consolas" w:hAnsi="Consolas"/>
           <w:sz w:val="18"/>
           <w:szCs w:val="18"/>
         </w:rPr>
-        <w:t>// FRIENDS_WITH relationships (bidirectional)</w:t>
-      </w:r>
-    </w:p>
-    <w:p>
-      <w:pPr>
-        <w:spacing w:after="0"/>
+      </w:pPr>
+      <w:r>
         <w:rPr>
           <w:rFonts w:ascii="Consolas" w:hAnsi="Consolas"/>
           <w:sz w:val="18"/>
           <w:szCs w:val="18"/>
         </w:rPr>
-      </w:pPr>
-    </w:p>
-    <w:p>
-      <w:pPr>
-        <w:spacing w:after="0"/>
+        <w:t xml:space="preserve">  (</w:t>
+      </w:r>
+      <w:proofErr w:type="spellStart"/>
+      <w:r>
         <w:rPr>
           <w:rFonts w:ascii="Consolas" w:hAnsi="Consolas"/>
           <w:sz w:val="18"/>
           <w:szCs w:val="18"/>
         </w:rPr>
-      </w:pPr>
+        <w:t>p:User</w:t>
+      </w:r>
+      <w:proofErr w:type="spellEnd"/>
       <w:r>
         <w:rPr>
           <w:rFonts w:ascii="Consolas" w:hAnsi="Consolas"/>
           <w:sz w:val="18"/>
           <w:szCs w:val="18"/>
         </w:rPr>
-        <w:t xml:space="preserve">  (a)-[:FRIENDS_WITH]-&gt;(d), (d)-[:FRIENDS_WITH]-&gt;(a),</w:t>
-      </w:r>
-    </w:p>
-    <w:p>
-      <w:pPr>
-        <w:spacing w:after="0"/>
+        <w:t xml:space="preserve"> {</w:t>
+      </w:r>
+      <w:proofErr w:type="spellStart"/>
+      <w:r>
         <w:rPr>
           <w:rFonts w:ascii="Consolas" w:hAnsi="Consolas"/>
           <w:sz w:val="18"/>
           <w:szCs w:val="18"/>
         </w:rPr>
-      </w:pPr>
+        <w:t>name:'Prasanna</w:t>
+      </w:r>
+      <w:proofErr w:type="spellEnd"/>
       <w:r>
         <w:rPr>
           <w:rFonts w:ascii="Consolas" w:hAnsi="Consolas"/>
           <w:sz w:val="18"/>
           <w:szCs w:val="18"/>
         </w:rPr>
-        <w:t xml:space="preserve">  (b)-[:FRIENDS_WITH]-&gt;(e), (e)-[:FRIENDS_WITH]-&gt;(b),</w:t>
-      </w:r>
-    </w:p>
-    <w:p>
-      <w:pPr>
-        <w:spacing w:after="0"/>
+        <w:t xml:space="preserve">', </w:t>
+      </w:r>
+      <w:proofErr w:type="spellStart"/>
+      <w:r>
         <w:rPr>
           <w:rFonts w:ascii="Consolas" w:hAnsi="Consolas"/>
           <w:sz w:val="18"/>
           <w:szCs w:val="18"/>
         </w:rPr>
-      </w:pPr>
+        <w:t>city:'Matara</w:t>
+      </w:r>
+      <w:proofErr w:type="spellEnd"/>
       <w:r>
         <w:rPr>
           <w:rFonts w:ascii="Consolas" w:hAnsi="Consolas"/>
           <w:sz w:val="18"/>
           <w:szCs w:val="18"/>
         </w:rPr>
-        <w:t xml:space="preserve">  (c)-[:FRIENDS_WITH]-&gt;(g), (g)-[:FRIENDS_WITH]-&gt;(c),</w:t>
+        <w:t>', dob: date('1993-12-03')}),</w:t>
       </w:r>
     </w:p>
     <w:p>
@@ -20609,7 +20886,1200 @@
           <w:sz w:val="18"/>
           <w:szCs w:val="18"/>
         </w:rPr>
-        <w:t xml:space="preserve">  (h)-[:FRIENDS_WITH]-&gt;(i), (i)-[:FRIENDS_WITH]-&gt;(h),</w:t>
+        <w:t xml:space="preserve">  (</w:t>
+      </w:r>
+      <w:proofErr w:type="spellStart"/>
+      <w:r>
+        <w:rPr>
+          <w:rFonts w:ascii="Consolas" w:hAnsi="Consolas"/>
+          <w:sz w:val="18"/>
+          <w:szCs w:val="18"/>
+        </w:rPr>
+        <w:t>q:User</w:t>
+      </w:r>
+      <w:proofErr w:type="spellEnd"/>
+      <w:r>
+        <w:rPr>
+          <w:rFonts w:ascii="Consolas" w:hAnsi="Consolas"/>
+          <w:sz w:val="18"/>
+          <w:szCs w:val="18"/>
+        </w:rPr>
+        <w:t xml:space="preserve"> {</w:t>
+      </w:r>
+      <w:proofErr w:type="spellStart"/>
+      <w:r>
+        <w:rPr>
+          <w:rFonts w:ascii="Consolas" w:hAnsi="Consolas"/>
+          <w:sz w:val="18"/>
+          <w:szCs w:val="18"/>
+        </w:rPr>
+        <w:t>name:'Nadeesha</w:t>
+      </w:r>
+      <w:proofErr w:type="spellEnd"/>
+      <w:r>
+        <w:rPr>
+          <w:rFonts w:ascii="Consolas" w:hAnsi="Consolas"/>
+          <w:sz w:val="18"/>
+          <w:szCs w:val="18"/>
+        </w:rPr>
+        <w:t xml:space="preserve">', </w:t>
+      </w:r>
+      <w:proofErr w:type="spellStart"/>
+      <w:r>
+        <w:rPr>
+          <w:rFonts w:ascii="Consolas" w:hAnsi="Consolas"/>
+          <w:sz w:val="18"/>
+          <w:szCs w:val="18"/>
+        </w:rPr>
+        <w:t>city:'Colombo</w:t>
+      </w:r>
+      <w:proofErr w:type="spellEnd"/>
+      <w:r>
+        <w:rPr>
+          <w:rFonts w:ascii="Consolas" w:hAnsi="Consolas"/>
+          <w:sz w:val="18"/>
+          <w:szCs w:val="18"/>
+        </w:rPr>
+        <w:t>', dob: date('1998-03-18')}),</w:t>
+      </w:r>
+    </w:p>
+    <w:p>
+      <w:pPr>
+        <w:spacing w:after="0"/>
+        <w:rPr>
+          <w:rFonts w:ascii="Consolas" w:hAnsi="Consolas"/>
+          <w:sz w:val="18"/>
+          <w:szCs w:val="18"/>
+        </w:rPr>
+      </w:pPr>
+      <w:r>
+        <w:rPr>
+          <w:rFonts w:ascii="Consolas" w:hAnsi="Consolas"/>
+          <w:sz w:val="18"/>
+          <w:szCs w:val="18"/>
+        </w:rPr>
+        <w:t xml:space="preserve">  (</w:t>
+      </w:r>
+      <w:proofErr w:type="spellStart"/>
+      <w:r>
+        <w:rPr>
+          <w:rFonts w:ascii="Consolas" w:hAnsi="Consolas"/>
+          <w:sz w:val="18"/>
+          <w:szCs w:val="18"/>
+        </w:rPr>
+        <w:t>r:User</w:t>
+      </w:r>
+      <w:proofErr w:type="spellEnd"/>
+      <w:r>
+        <w:rPr>
+          <w:rFonts w:ascii="Consolas" w:hAnsi="Consolas"/>
+          <w:sz w:val="18"/>
+          <w:szCs w:val="18"/>
+        </w:rPr>
+        <w:t xml:space="preserve"> {</w:t>
+      </w:r>
+      <w:proofErr w:type="spellStart"/>
+      <w:r>
+        <w:rPr>
+          <w:rFonts w:ascii="Consolas" w:hAnsi="Consolas"/>
+          <w:sz w:val="18"/>
+          <w:szCs w:val="18"/>
+        </w:rPr>
+        <w:t>name:'Upeksha</w:t>
+      </w:r>
+      <w:proofErr w:type="spellEnd"/>
+      <w:r>
+        <w:rPr>
+          <w:rFonts w:ascii="Consolas" w:hAnsi="Consolas"/>
+          <w:sz w:val="18"/>
+          <w:szCs w:val="18"/>
+        </w:rPr>
+        <w:t xml:space="preserve">', </w:t>
+      </w:r>
+      <w:proofErr w:type="spellStart"/>
+      <w:r>
+        <w:rPr>
+          <w:rFonts w:ascii="Consolas" w:hAnsi="Consolas"/>
+          <w:sz w:val="18"/>
+          <w:szCs w:val="18"/>
+        </w:rPr>
+        <w:t>city:'Negombo</w:t>
+      </w:r>
+      <w:proofErr w:type="spellEnd"/>
+      <w:r>
+        <w:rPr>
+          <w:rFonts w:ascii="Consolas" w:hAnsi="Consolas"/>
+          <w:sz w:val="18"/>
+          <w:szCs w:val="18"/>
+        </w:rPr>
+        <w:t>', dob: date('1997-08-25')}),</w:t>
+      </w:r>
+    </w:p>
+    <w:p>
+      <w:pPr>
+        <w:spacing w:after="0"/>
+        <w:rPr>
+          <w:rFonts w:ascii="Consolas" w:hAnsi="Consolas"/>
+          <w:sz w:val="18"/>
+          <w:szCs w:val="18"/>
+        </w:rPr>
+      </w:pPr>
+      <w:r>
+        <w:rPr>
+          <w:rFonts w:ascii="Consolas" w:hAnsi="Consolas"/>
+          <w:sz w:val="18"/>
+          <w:szCs w:val="18"/>
+        </w:rPr>
+        <w:t xml:space="preserve">  (</w:t>
+      </w:r>
+      <w:proofErr w:type="spellStart"/>
+      <w:r>
+        <w:rPr>
+          <w:rFonts w:ascii="Consolas" w:hAnsi="Consolas"/>
+          <w:sz w:val="18"/>
+          <w:szCs w:val="18"/>
+        </w:rPr>
+        <w:t>s:User</w:t>
+      </w:r>
+      <w:proofErr w:type="spellEnd"/>
+      <w:r>
+        <w:rPr>
+          <w:rFonts w:ascii="Consolas" w:hAnsi="Consolas"/>
+          <w:sz w:val="18"/>
+          <w:szCs w:val="18"/>
+        </w:rPr>
+        <w:t xml:space="preserve"> {name:'</w:t>
+      </w:r>
+      <w:proofErr w:type="spellStart"/>
+      <w:r>
+        <w:rPr>
+          <w:rFonts w:ascii="Consolas" w:hAnsi="Consolas"/>
+          <w:sz w:val="18"/>
+          <w:szCs w:val="18"/>
+        </w:rPr>
+        <w:t>Yasiru</w:t>
+      </w:r>
+      <w:proofErr w:type="spellEnd"/>
+      <w:r>
+        <w:rPr>
+          <w:rFonts w:ascii="Consolas" w:hAnsi="Consolas"/>
+          <w:sz w:val="18"/>
+          <w:szCs w:val="18"/>
+        </w:rPr>
+        <w:t xml:space="preserve">', </w:t>
+      </w:r>
+      <w:proofErr w:type="spellStart"/>
+      <w:r>
+        <w:rPr>
+          <w:rFonts w:ascii="Consolas" w:hAnsi="Consolas"/>
+          <w:sz w:val="18"/>
+          <w:szCs w:val="18"/>
+        </w:rPr>
+        <w:t>city:'Kandy</w:t>
+      </w:r>
+      <w:proofErr w:type="spellEnd"/>
+      <w:r>
+        <w:rPr>
+          <w:rFonts w:ascii="Consolas" w:hAnsi="Consolas"/>
+          <w:sz w:val="18"/>
+          <w:szCs w:val="18"/>
+        </w:rPr>
+        <w:t>', dob: date('1994-05-16')}),</w:t>
+      </w:r>
+    </w:p>
+    <w:p>
+      <w:pPr>
+        <w:spacing w:after="0"/>
+        <w:rPr>
+          <w:rFonts w:ascii="Consolas" w:hAnsi="Consolas"/>
+          <w:sz w:val="18"/>
+          <w:szCs w:val="18"/>
+        </w:rPr>
+      </w:pPr>
+      <w:r>
+        <w:rPr>
+          <w:rFonts w:ascii="Consolas" w:hAnsi="Consolas"/>
+          <w:sz w:val="18"/>
+          <w:szCs w:val="18"/>
+        </w:rPr>
+        <w:t xml:space="preserve">  (</w:t>
+      </w:r>
+      <w:proofErr w:type="spellStart"/>
+      <w:r>
+        <w:rPr>
+          <w:rFonts w:ascii="Consolas" w:hAnsi="Consolas"/>
+          <w:sz w:val="18"/>
+          <w:szCs w:val="18"/>
+        </w:rPr>
+        <w:t>t:User</w:t>
+      </w:r>
+      <w:proofErr w:type="spellEnd"/>
+      <w:r>
+        <w:rPr>
+          <w:rFonts w:ascii="Consolas" w:hAnsi="Consolas"/>
+          <w:sz w:val="18"/>
+          <w:szCs w:val="18"/>
+        </w:rPr>
+        <w:t xml:space="preserve"> {</w:t>
+      </w:r>
+      <w:proofErr w:type="spellStart"/>
+      <w:r>
+        <w:rPr>
+          <w:rFonts w:ascii="Consolas" w:hAnsi="Consolas"/>
+          <w:sz w:val="18"/>
+          <w:szCs w:val="18"/>
+        </w:rPr>
+        <w:t>name:'Thilini</w:t>
+      </w:r>
+      <w:proofErr w:type="spellEnd"/>
+      <w:r>
+        <w:rPr>
+          <w:rFonts w:ascii="Consolas" w:hAnsi="Consolas"/>
+          <w:sz w:val="18"/>
+          <w:szCs w:val="18"/>
+        </w:rPr>
+        <w:t xml:space="preserve">', </w:t>
+      </w:r>
+      <w:proofErr w:type="spellStart"/>
+      <w:r>
+        <w:rPr>
+          <w:rFonts w:ascii="Consolas" w:hAnsi="Consolas"/>
+          <w:sz w:val="18"/>
+          <w:szCs w:val="18"/>
+        </w:rPr>
+        <w:t>city:'Galle</w:t>
+      </w:r>
+      <w:proofErr w:type="spellEnd"/>
+      <w:r>
+        <w:rPr>
+          <w:rFonts w:ascii="Consolas" w:hAnsi="Consolas"/>
+          <w:sz w:val="18"/>
+          <w:szCs w:val="18"/>
+        </w:rPr>
+        <w:t>', dob: date('1996-11-21')}),</w:t>
+      </w:r>
+    </w:p>
+    <w:p>
+      <w:pPr>
+        <w:spacing w:after="0"/>
+        <w:rPr>
+          <w:rFonts w:ascii="Consolas" w:hAnsi="Consolas"/>
+          <w:sz w:val="18"/>
+          <w:szCs w:val="18"/>
+        </w:rPr>
+      </w:pPr>
+    </w:p>
+    <w:p>
+      <w:pPr>
+        <w:spacing w:after="0"/>
+        <w:rPr>
+          <w:rFonts w:ascii="Consolas" w:hAnsi="Consolas"/>
+          <w:sz w:val="18"/>
+          <w:szCs w:val="18"/>
+        </w:rPr>
+      </w:pPr>
+      <w:r>
+        <w:rPr>
+          <w:rFonts w:ascii="Consolas" w:hAnsi="Consolas"/>
+          <w:sz w:val="18"/>
+          <w:szCs w:val="18"/>
+        </w:rPr>
+        <w:t>// FOLLOWS relationships (directed)</w:t>
+      </w:r>
+    </w:p>
+    <w:p>
+      <w:pPr>
+        <w:spacing w:after="0"/>
+        <w:rPr>
+          <w:rFonts w:ascii="Consolas" w:hAnsi="Consolas"/>
+          <w:sz w:val="18"/>
+          <w:szCs w:val="18"/>
+        </w:rPr>
+      </w:pPr>
+    </w:p>
+    <w:p>
+      <w:pPr>
+        <w:spacing w:after="0"/>
+        <w:rPr>
+          <w:rFonts w:ascii="Consolas" w:hAnsi="Consolas"/>
+          <w:sz w:val="18"/>
+          <w:szCs w:val="18"/>
+        </w:rPr>
+      </w:pPr>
+      <w:r>
+        <w:rPr>
+          <w:rFonts w:ascii="Consolas" w:hAnsi="Consolas"/>
+          <w:sz w:val="18"/>
+          <w:szCs w:val="18"/>
+        </w:rPr>
+        <w:t xml:space="preserve">  (a)-[:FOLLOWS]-&gt;(b),</w:t>
+      </w:r>
+    </w:p>
+    <w:p>
+      <w:pPr>
+        <w:spacing w:after="0"/>
+        <w:rPr>
+          <w:rFonts w:ascii="Consolas" w:hAnsi="Consolas"/>
+          <w:sz w:val="18"/>
+          <w:szCs w:val="18"/>
+        </w:rPr>
+      </w:pPr>
+      <w:r>
+        <w:rPr>
+          <w:rFonts w:ascii="Consolas" w:hAnsi="Consolas"/>
+          <w:sz w:val="18"/>
+          <w:szCs w:val="18"/>
+        </w:rPr>
+        <w:t xml:space="preserve">  (a)-[:FOLLOWS]-&gt;(c),</w:t>
+      </w:r>
+    </w:p>
+    <w:p>
+      <w:pPr>
+        <w:spacing w:after="0"/>
+        <w:rPr>
+          <w:rFonts w:ascii="Consolas" w:hAnsi="Consolas"/>
+          <w:sz w:val="18"/>
+          <w:szCs w:val="18"/>
+        </w:rPr>
+      </w:pPr>
+      <w:r>
+        <w:rPr>
+          <w:rFonts w:ascii="Consolas" w:hAnsi="Consolas"/>
+          <w:sz w:val="18"/>
+          <w:szCs w:val="18"/>
+        </w:rPr>
+        <w:t xml:space="preserve">  (a)-[:FOLLOWS]-&gt;(d),</w:t>
+      </w:r>
+    </w:p>
+    <w:p>
+      <w:pPr>
+        <w:spacing w:after="0"/>
+        <w:rPr>
+          <w:rFonts w:ascii="Consolas" w:hAnsi="Consolas"/>
+          <w:sz w:val="18"/>
+          <w:szCs w:val="18"/>
+        </w:rPr>
+      </w:pPr>
+      <w:r>
+        <w:rPr>
+          <w:rFonts w:ascii="Consolas" w:hAnsi="Consolas"/>
+          <w:sz w:val="18"/>
+          <w:szCs w:val="18"/>
+        </w:rPr>
+        <w:t xml:space="preserve">  (b)-[:FOLLOWS]-&gt;(a),</w:t>
+      </w:r>
+    </w:p>
+    <w:p>
+      <w:pPr>
+        <w:spacing w:after="0"/>
+        <w:rPr>
+          <w:rFonts w:ascii="Consolas" w:hAnsi="Consolas"/>
+          <w:sz w:val="18"/>
+          <w:szCs w:val="18"/>
+        </w:rPr>
+      </w:pPr>
+      <w:r>
+        <w:rPr>
+          <w:rFonts w:ascii="Consolas" w:hAnsi="Consolas"/>
+          <w:sz w:val="18"/>
+          <w:szCs w:val="18"/>
+        </w:rPr>
+        <w:t xml:space="preserve">  (b)-[:FOLLOWS]-&gt;(e),</w:t>
+      </w:r>
+    </w:p>
+    <w:p>
+      <w:pPr>
+        <w:spacing w:after="0"/>
+        <w:rPr>
+          <w:rFonts w:ascii="Consolas" w:hAnsi="Consolas"/>
+          <w:sz w:val="18"/>
+          <w:szCs w:val="18"/>
+        </w:rPr>
+      </w:pPr>
+      <w:r>
+        <w:rPr>
+          <w:rFonts w:ascii="Consolas" w:hAnsi="Consolas"/>
+          <w:sz w:val="18"/>
+          <w:szCs w:val="18"/>
+        </w:rPr>
+        <w:t xml:space="preserve">  (b)-[:FOLLOWS]-&gt;(f),</w:t>
+      </w:r>
+    </w:p>
+    <w:p>
+      <w:pPr>
+        <w:spacing w:after="0"/>
+        <w:rPr>
+          <w:rFonts w:ascii="Consolas" w:hAnsi="Consolas"/>
+          <w:sz w:val="18"/>
+          <w:szCs w:val="18"/>
+        </w:rPr>
+      </w:pPr>
+      <w:r>
+        <w:rPr>
+          <w:rFonts w:ascii="Consolas" w:hAnsi="Consolas"/>
+          <w:sz w:val="18"/>
+          <w:szCs w:val="18"/>
+        </w:rPr>
+        <w:t xml:space="preserve">  (c)-[:FOLLOWS]-&gt;(a),</w:t>
+      </w:r>
+    </w:p>
+    <w:p>
+      <w:pPr>
+        <w:spacing w:after="0"/>
+        <w:rPr>
+          <w:rFonts w:ascii="Consolas" w:hAnsi="Consolas"/>
+          <w:sz w:val="18"/>
+          <w:szCs w:val="18"/>
+        </w:rPr>
+      </w:pPr>
+      <w:r>
+        <w:rPr>
+          <w:rFonts w:ascii="Consolas" w:hAnsi="Consolas"/>
+          <w:sz w:val="18"/>
+          <w:szCs w:val="18"/>
+        </w:rPr>
+        <w:t xml:space="preserve">  (c)-[:FOLLOWS]-&gt;(h),</w:t>
+      </w:r>
+    </w:p>
+    <w:p>
+      <w:pPr>
+        <w:spacing w:after="0"/>
+        <w:rPr>
+          <w:rFonts w:ascii="Consolas" w:hAnsi="Consolas"/>
+          <w:sz w:val="18"/>
+          <w:szCs w:val="18"/>
+        </w:rPr>
+      </w:pPr>
+      <w:r>
+        <w:rPr>
+          <w:rFonts w:ascii="Consolas" w:hAnsi="Consolas"/>
+          <w:sz w:val="18"/>
+          <w:szCs w:val="18"/>
+        </w:rPr>
+        <w:t xml:space="preserve">  (c)-[:FOLLOWS]-&gt;(j),</w:t>
+      </w:r>
+    </w:p>
+    <w:p>
+      <w:pPr>
+        <w:spacing w:after="0"/>
+        <w:rPr>
+          <w:rFonts w:ascii="Consolas" w:hAnsi="Consolas"/>
+          <w:sz w:val="18"/>
+          <w:szCs w:val="18"/>
+        </w:rPr>
+      </w:pPr>
+      <w:r>
+        <w:rPr>
+          <w:rFonts w:ascii="Consolas" w:hAnsi="Consolas"/>
+          <w:sz w:val="18"/>
+          <w:szCs w:val="18"/>
+        </w:rPr>
+        <w:t xml:space="preserve">  (d)-[:FOLLOWS]-&gt;(f),</w:t>
+      </w:r>
+    </w:p>
+    <w:p>
+      <w:pPr>
+        <w:spacing w:after="0"/>
+        <w:rPr>
+          <w:rFonts w:ascii="Consolas" w:hAnsi="Consolas"/>
+          <w:sz w:val="18"/>
+          <w:szCs w:val="18"/>
+        </w:rPr>
+      </w:pPr>
+      <w:r>
+        <w:rPr>
+          <w:rFonts w:ascii="Consolas" w:hAnsi="Consolas"/>
+          <w:sz w:val="18"/>
+          <w:szCs w:val="18"/>
+        </w:rPr>
+        <w:t xml:space="preserve">  (d)-[:FOLLOWS]-&gt;(g),</w:t>
+      </w:r>
+    </w:p>
+    <w:p>
+      <w:pPr>
+        <w:spacing w:after="0"/>
+        <w:rPr>
+          <w:rFonts w:ascii="Consolas" w:hAnsi="Consolas"/>
+          <w:sz w:val="18"/>
+          <w:szCs w:val="18"/>
+        </w:rPr>
+      </w:pPr>
+      <w:r>
+        <w:rPr>
+          <w:rFonts w:ascii="Consolas" w:hAnsi="Consolas"/>
+          <w:sz w:val="18"/>
+          <w:szCs w:val="18"/>
+        </w:rPr>
+        <w:t xml:space="preserve">  (e)-[:FOLLOWS]-&gt;(c),</w:t>
+      </w:r>
+    </w:p>
+    <w:p>
+      <w:pPr>
+        <w:spacing w:after="0"/>
+        <w:rPr>
+          <w:rFonts w:ascii="Consolas" w:hAnsi="Consolas"/>
+          <w:sz w:val="18"/>
+          <w:szCs w:val="18"/>
+        </w:rPr>
+      </w:pPr>
+      <w:r>
+        <w:rPr>
+          <w:rFonts w:ascii="Consolas" w:hAnsi="Consolas"/>
+          <w:sz w:val="18"/>
+          <w:szCs w:val="18"/>
+        </w:rPr>
+        <w:t xml:space="preserve">  (e)-[:FOLLOWS]-&gt;(</w:t>
+      </w:r>
+      <w:proofErr w:type="spellStart"/>
+      <w:r>
+        <w:rPr>
+          <w:rFonts w:ascii="Consolas" w:hAnsi="Consolas"/>
+          <w:sz w:val="18"/>
+          <w:szCs w:val="18"/>
+        </w:rPr>
+        <w:t>i</w:t>
+      </w:r>
+      <w:proofErr w:type="spellEnd"/>
+      <w:r>
+        <w:rPr>
+          <w:rFonts w:ascii="Consolas" w:hAnsi="Consolas"/>
+          <w:sz w:val="18"/>
+          <w:szCs w:val="18"/>
+        </w:rPr>
+        <w:t>),</w:t>
+      </w:r>
+    </w:p>
+    <w:p>
+      <w:pPr>
+        <w:spacing w:after="0"/>
+        <w:rPr>
+          <w:rFonts w:ascii="Consolas" w:hAnsi="Consolas"/>
+          <w:sz w:val="18"/>
+          <w:szCs w:val="18"/>
+        </w:rPr>
+      </w:pPr>
+      <w:r>
+        <w:rPr>
+          <w:rFonts w:ascii="Consolas" w:hAnsi="Consolas"/>
+          <w:sz w:val="18"/>
+          <w:szCs w:val="18"/>
+        </w:rPr>
+        <w:t xml:space="preserve">  (f)-[:FOLLOWS]-&gt;(j),</w:t>
+      </w:r>
+    </w:p>
+    <w:p>
+      <w:pPr>
+        <w:spacing w:after="0"/>
+        <w:rPr>
+          <w:rFonts w:ascii="Consolas" w:hAnsi="Consolas"/>
+          <w:sz w:val="18"/>
+          <w:szCs w:val="18"/>
+        </w:rPr>
+      </w:pPr>
+      <w:r>
+        <w:rPr>
+          <w:rFonts w:ascii="Consolas" w:hAnsi="Consolas"/>
+          <w:sz w:val="18"/>
+          <w:szCs w:val="18"/>
+        </w:rPr>
+        <w:t xml:space="preserve">  (f)-[:FOLLOWS]-&gt;(k),</w:t>
+      </w:r>
+    </w:p>
+    <w:p>
+      <w:pPr>
+        <w:spacing w:after="0"/>
+        <w:rPr>
+          <w:rFonts w:ascii="Consolas" w:hAnsi="Consolas"/>
+          <w:sz w:val="18"/>
+          <w:szCs w:val="18"/>
+        </w:rPr>
+      </w:pPr>
+      <w:r>
+        <w:rPr>
+          <w:rFonts w:ascii="Consolas" w:hAnsi="Consolas"/>
+          <w:sz w:val="18"/>
+          <w:szCs w:val="18"/>
+        </w:rPr>
+        <w:t xml:space="preserve">  (g)-[:FOLLOWS]-&gt;(l),</w:t>
+      </w:r>
+    </w:p>
+    <w:p>
+      <w:pPr>
+        <w:spacing w:after="0"/>
+        <w:rPr>
+          <w:rFonts w:ascii="Consolas" w:hAnsi="Consolas"/>
+          <w:sz w:val="18"/>
+          <w:szCs w:val="18"/>
+        </w:rPr>
+      </w:pPr>
+      <w:r>
+        <w:rPr>
+          <w:rFonts w:ascii="Consolas" w:hAnsi="Consolas"/>
+          <w:sz w:val="18"/>
+          <w:szCs w:val="18"/>
+        </w:rPr>
+        <w:t xml:space="preserve">  (h)-[:FOLLOWS]-&gt;(m),</w:t>
+      </w:r>
+    </w:p>
+    <w:p>
+      <w:pPr>
+        <w:spacing w:after="0"/>
+        <w:rPr>
+          <w:rFonts w:ascii="Consolas" w:hAnsi="Consolas"/>
+          <w:sz w:val="18"/>
+          <w:szCs w:val="18"/>
+        </w:rPr>
+      </w:pPr>
+      <w:r>
+        <w:rPr>
+          <w:rFonts w:ascii="Consolas" w:hAnsi="Consolas"/>
+          <w:sz w:val="18"/>
+          <w:szCs w:val="18"/>
+        </w:rPr>
+        <w:t xml:space="preserve">  (</w:t>
+      </w:r>
+      <w:proofErr w:type="spellStart"/>
+      <w:r>
+        <w:rPr>
+          <w:rFonts w:ascii="Consolas" w:hAnsi="Consolas"/>
+          <w:sz w:val="18"/>
+          <w:szCs w:val="18"/>
+        </w:rPr>
+        <w:t>i</w:t>
+      </w:r>
+      <w:proofErr w:type="spellEnd"/>
+      <w:r>
+        <w:rPr>
+          <w:rFonts w:ascii="Consolas" w:hAnsi="Consolas"/>
+          <w:sz w:val="18"/>
+          <w:szCs w:val="18"/>
+        </w:rPr>
+        <w:t>)-[:FOLLOWS]-&gt;(b),</w:t>
+      </w:r>
+    </w:p>
+    <w:p>
+      <w:pPr>
+        <w:spacing w:after="0"/>
+        <w:rPr>
+          <w:rFonts w:ascii="Consolas" w:hAnsi="Consolas"/>
+          <w:sz w:val="18"/>
+          <w:szCs w:val="18"/>
+        </w:rPr>
+      </w:pPr>
+      <w:r>
+        <w:rPr>
+          <w:rFonts w:ascii="Consolas" w:hAnsi="Consolas"/>
+          <w:sz w:val="18"/>
+          <w:szCs w:val="18"/>
+        </w:rPr>
+        <w:t xml:space="preserve">  (</w:t>
+      </w:r>
+      <w:proofErr w:type="spellStart"/>
+      <w:r>
+        <w:rPr>
+          <w:rFonts w:ascii="Consolas" w:hAnsi="Consolas"/>
+          <w:sz w:val="18"/>
+          <w:szCs w:val="18"/>
+        </w:rPr>
+        <w:t>i</w:t>
+      </w:r>
+      <w:proofErr w:type="spellEnd"/>
+      <w:r>
+        <w:rPr>
+          <w:rFonts w:ascii="Consolas" w:hAnsi="Consolas"/>
+          <w:sz w:val="18"/>
+          <w:szCs w:val="18"/>
+        </w:rPr>
+        <w:t>)-[:FOLLOWS]-&gt;(c),</w:t>
+      </w:r>
+    </w:p>
+    <w:p>
+      <w:pPr>
+        <w:spacing w:after="0"/>
+        <w:rPr>
+          <w:rFonts w:ascii="Consolas" w:hAnsi="Consolas"/>
+          <w:sz w:val="18"/>
+          <w:szCs w:val="18"/>
+        </w:rPr>
+      </w:pPr>
+      <w:r>
+        <w:rPr>
+          <w:rFonts w:ascii="Consolas" w:hAnsi="Consolas"/>
+          <w:sz w:val="18"/>
+          <w:szCs w:val="18"/>
+        </w:rPr>
+        <w:t xml:space="preserve">  (j)-[:FOLLOWS]-&gt;(a),</w:t>
+      </w:r>
+    </w:p>
+    <w:p>
+      <w:pPr>
+        <w:spacing w:after="0"/>
+        <w:rPr>
+          <w:rFonts w:ascii="Consolas" w:hAnsi="Consolas"/>
+          <w:sz w:val="18"/>
+          <w:szCs w:val="18"/>
+        </w:rPr>
+      </w:pPr>
+      <w:r>
+        <w:rPr>
+          <w:rFonts w:ascii="Consolas" w:hAnsi="Consolas"/>
+          <w:sz w:val="18"/>
+          <w:szCs w:val="18"/>
+        </w:rPr>
+        <w:t xml:space="preserve">  (j)-[:FOLLOWS]-&gt;(n),</w:t>
+      </w:r>
+    </w:p>
+    <w:p>
+      <w:pPr>
+        <w:spacing w:after="0"/>
+        <w:rPr>
+          <w:rFonts w:ascii="Consolas" w:hAnsi="Consolas"/>
+          <w:sz w:val="18"/>
+          <w:szCs w:val="18"/>
+        </w:rPr>
+      </w:pPr>
+      <w:r>
+        <w:rPr>
+          <w:rFonts w:ascii="Consolas" w:hAnsi="Consolas"/>
+          <w:sz w:val="18"/>
+          <w:szCs w:val="18"/>
+        </w:rPr>
+        <w:t xml:space="preserve">  (k)-[:FOLLOWS]-&gt;(o),</w:t>
+      </w:r>
+    </w:p>
+    <w:p>
+      <w:pPr>
+        <w:spacing w:after="0"/>
+        <w:rPr>
+          <w:rFonts w:ascii="Consolas" w:hAnsi="Consolas"/>
+          <w:sz w:val="18"/>
+          <w:szCs w:val="18"/>
+        </w:rPr>
+      </w:pPr>
+      <w:r>
+        <w:rPr>
+          <w:rFonts w:ascii="Consolas" w:hAnsi="Consolas"/>
+          <w:sz w:val="18"/>
+          <w:szCs w:val="18"/>
+        </w:rPr>
+        <w:t xml:space="preserve">  (l)-[:FOLLOWS]-&gt;(p),</w:t>
+      </w:r>
+    </w:p>
+    <w:p>
+      <w:pPr>
+        <w:spacing w:after="0"/>
+        <w:rPr>
+          <w:rFonts w:ascii="Consolas" w:hAnsi="Consolas"/>
+          <w:sz w:val="18"/>
+          <w:szCs w:val="18"/>
+        </w:rPr>
+      </w:pPr>
+      <w:r>
+        <w:rPr>
+          <w:rFonts w:ascii="Consolas" w:hAnsi="Consolas"/>
+          <w:sz w:val="18"/>
+          <w:szCs w:val="18"/>
+        </w:rPr>
+        <w:lastRenderedPageBreak/>
+        <w:t xml:space="preserve">  (m)-[:FOLLOWS]-&gt;(q),</w:t>
+      </w:r>
+    </w:p>
+    <w:p>
+      <w:pPr>
+        <w:spacing w:after="0"/>
+        <w:rPr>
+          <w:rFonts w:ascii="Consolas" w:hAnsi="Consolas"/>
+          <w:sz w:val="18"/>
+          <w:szCs w:val="18"/>
+        </w:rPr>
+      </w:pPr>
+      <w:r>
+        <w:rPr>
+          <w:rFonts w:ascii="Consolas" w:hAnsi="Consolas"/>
+          <w:sz w:val="18"/>
+          <w:szCs w:val="18"/>
+        </w:rPr>
+        <w:t xml:space="preserve">  (n)-[:FOLLOWS]-&gt;(r),</w:t>
+      </w:r>
+    </w:p>
+    <w:p>
+      <w:pPr>
+        <w:spacing w:after="0"/>
+        <w:rPr>
+          <w:rFonts w:ascii="Consolas" w:hAnsi="Consolas"/>
+          <w:sz w:val="18"/>
+          <w:szCs w:val="18"/>
+        </w:rPr>
+      </w:pPr>
+      <w:r>
+        <w:rPr>
+          <w:rFonts w:ascii="Consolas" w:hAnsi="Consolas"/>
+          <w:sz w:val="18"/>
+          <w:szCs w:val="18"/>
+        </w:rPr>
+        <w:t xml:space="preserve">  (o)-[:FOLLOWS]-&gt;(s),</w:t>
+      </w:r>
+    </w:p>
+    <w:p>
+      <w:pPr>
+        <w:spacing w:after="0"/>
+        <w:rPr>
+          <w:rFonts w:ascii="Consolas" w:hAnsi="Consolas"/>
+          <w:sz w:val="18"/>
+          <w:szCs w:val="18"/>
+        </w:rPr>
+      </w:pPr>
+      <w:r>
+        <w:rPr>
+          <w:rFonts w:ascii="Consolas" w:hAnsi="Consolas"/>
+          <w:sz w:val="18"/>
+          <w:szCs w:val="18"/>
+        </w:rPr>
+        <w:t xml:space="preserve">  (p)-[:FOLLOWS]-&gt;(a),</w:t>
+      </w:r>
+    </w:p>
+    <w:p>
+      <w:pPr>
+        <w:spacing w:after="0"/>
+        <w:rPr>
+          <w:rFonts w:ascii="Consolas" w:hAnsi="Consolas"/>
+          <w:sz w:val="18"/>
+          <w:szCs w:val="18"/>
+        </w:rPr>
+      </w:pPr>
+      <w:r>
+        <w:rPr>
+          <w:rFonts w:ascii="Consolas" w:hAnsi="Consolas"/>
+          <w:sz w:val="18"/>
+          <w:szCs w:val="18"/>
+        </w:rPr>
+        <w:t xml:space="preserve">  (p)-[:FOLLOWS]-&gt;(t),</w:t>
+      </w:r>
+    </w:p>
+    <w:p>
+      <w:pPr>
+        <w:spacing w:after="0"/>
+        <w:rPr>
+          <w:rFonts w:ascii="Consolas" w:hAnsi="Consolas"/>
+          <w:sz w:val="18"/>
+          <w:szCs w:val="18"/>
+        </w:rPr>
+      </w:pPr>
+      <w:r>
+        <w:rPr>
+          <w:rFonts w:ascii="Consolas" w:hAnsi="Consolas"/>
+          <w:sz w:val="18"/>
+          <w:szCs w:val="18"/>
+        </w:rPr>
+        <w:t xml:space="preserve">  (q)-[:FOLLOWS]-&gt;(a),</w:t>
+      </w:r>
+    </w:p>
+    <w:p>
+      <w:pPr>
+        <w:spacing w:after="0"/>
+        <w:rPr>
+          <w:rFonts w:ascii="Consolas" w:hAnsi="Consolas"/>
+          <w:sz w:val="18"/>
+          <w:szCs w:val="18"/>
+        </w:rPr>
+      </w:pPr>
+      <w:r>
+        <w:rPr>
+          <w:rFonts w:ascii="Consolas" w:hAnsi="Consolas"/>
+          <w:sz w:val="18"/>
+          <w:szCs w:val="18"/>
+        </w:rPr>
+        <w:t xml:space="preserve">  (r)-[:FOLLOWS]-&gt;(d),</w:t>
+      </w:r>
+    </w:p>
+    <w:p>
+      <w:pPr>
+        <w:spacing w:after="0"/>
+        <w:rPr>
+          <w:rFonts w:ascii="Consolas" w:hAnsi="Consolas"/>
+          <w:sz w:val="18"/>
+          <w:szCs w:val="18"/>
+        </w:rPr>
+      </w:pPr>
+      <w:r>
+        <w:rPr>
+          <w:rFonts w:ascii="Consolas" w:hAnsi="Consolas"/>
+          <w:sz w:val="18"/>
+          <w:szCs w:val="18"/>
+        </w:rPr>
+        <w:t xml:space="preserve">  (r)-[:FOLLOWS]-&gt;(g),</w:t>
+      </w:r>
+    </w:p>
+    <w:p>
+      <w:pPr>
+        <w:spacing w:after="0"/>
+        <w:rPr>
+          <w:rFonts w:ascii="Consolas" w:hAnsi="Consolas"/>
+          <w:sz w:val="18"/>
+          <w:szCs w:val="18"/>
+        </w:rPr>
+      </w:pPr>
+      <w:r>
+        <w:rPr>
+          <w:rFonts w:ascii="Consolas" w:hAnsi="Consolas"/>
+          <w:sz w:val="18"/>
+          <w:szCs w:val="18"/>
+        </w:rPr>
+        <w:t xml:space="preserve">  (s)-[:FOLLOWS]-&gt;(h),</w:t>
+      </w:r>
+    </w:p>
+    <w:p>
+      <w:pPr>
+        <w:spacing w:after="0"/>
+        <w:rPr>
+          <w:rFonts w:ascii="Consolas" w:hAnsi="Consolas"/>
+          <w:sz w:val="18"/>
+          <w:szCs w:val="18"/>
+        </w:rPr>
+      </w:pPr>
+      <w:r>
+        <w:rPr>
+          <w:rFonts w:ascii="Consolas" w:hAnsi="Consolas"/>
+          <w:sz w:val="18"/>
+          <w:szCs w:val="18"/>
+        </w:rPr>
+        <w:t xml:space="preserve">  (s)-[:FOLLOWS]-&gt;(</w:t>
+      </w:r>
+      <w:proofErr w:type="spellStart"/>
+      <w:r>
+        <w:rPr>
+          <w:rFonts w:ascii="Consolas" w:hAnsi="Consolas"/>
+          <w:sz w:val="18"/>
+          <w:szCs w:val="18"/>
+        </w:rPr>
+        <w:t>i</w:t>
+      </w:r>
+      <w:proofErr w:type="spellEnd"/>
+      <w:r>
+        <w:rPr>
+          <w:rFonts w:ascii="Consolas" w:hAnsi="Consolas"/>
+          <w:sz w:val="18"/>
+          <w:szCs w:val="18"/>
+        </w:rPr>
+        <w:t>),</w:t>
+      </w:r>
+    </w:p>
+    <w:p>
+      <w:pPr>
+        <w:spacing w:after="0"/>
+        <w:rPr>
+          <w:rFonts w:ascii="Consolas" w:hAnsi="Consolas"/>
+          <w:sz w:val="18"/>
+          <w:szCs w:val="18"/>
+        </w:rPr>
+      </w:pPr>
+      <w:r>
+        <w:rPr>
+          <w:rFonts w:ascii="Consolas" w:hAnsi="Consolas"/>
+          <w:sz w:val="18"/>
+          <w:szCs w:val="18"/>
+        </w:rPr>
+        <w:t xml:space="preserve">  (t)-[:FOLLOWS]-&gt;(b),</w:t>
+      </w:r>
+    </w:p>
+    <w:p>
+      <w:pPr>
+        <w:spacing w:after="0"/>
+        <w:rPr>
+          <w:rFonts w:ascii="Consolas" w:hAnsi="Consolas"/>
+          <w:sz w:val="18"/>
+          <w:szCs w:val="18"/>
+        </w:rPr>
+      </w:pPr>
+      <w:r>
+        <w:rPr>
+          <w:rFonts w:ascii="Consolas" w:hAnsi="Consolas"/>
+          <w:sz w:val="18"/>
+          <w:szCs w:val="18"/>
+        </w:rPr>
+        <w:t xml:space="preserve">  (t)-[:FOLLOWS]-&gt;(j),</w:t>
+      </w:r>
+    </w:p>
+    <w:p>
+      <w:pPr>
+        <w:spacing w:after="0"/>
+        <w:rPr>
+          <w:rFonts w:ascii="Consolas" w:hAnsi="Consolas"/>
+          <w:sz w:val="18"/>
+          <w:szCs w:val="18"/>
+        </w:rPr>
+      </w:pPr>
+      <w:r>
+        <w:rPr>
+          <w:rFonts w:ascii="Consolas" w:hAnsi="Consolas"/>
+          <w:sz w:val="18"/>
+          <w:szCs w:val="18"/>
+        </w:rPr>
+        <w:t xml:space="preserve">  (t)-[:FOLLOWS]-&gt;(m),</w:t>
+      </w:r>
+    </w:p>
+    <w:p>
+      <w:pPr>
+        <w:spacing w:after="0"/>
+        <w:rPr>
+          <w:rFonts w:ascii="Consolas" w:hAnsi="Consolas"/>
+          <w:sz w:val="18"/>
+          <w:szCs w:val="18"/>
+        </w:rPr>
+      </w:pPr>
+      <w:r>
+        <w:rPr>
+          <w:rFonts w:ascii="Consolas" w:hAnsi="Consolas"/>
+          <w:sz w:val="18"/>
+          <w:szCs w:val="18"/>
+        </w:rPr>
+        <w:t xml:space="preserve">  (n)-[:FOLLOWS]-&gt;(f),</w:t>
+      </w:r>
+    </w:p>
+    <w:p>
+      <w:pPr>
+        <w:spacing w:after="0"/>
+        <w:rPr>
+          <w:rFonts w:ascii="Consolas" w:hAnsi="Consolas"/>
+          <w:sz w:val="18"/>
+          <w:szCs w:val="18"/>
+        </w:rPr>
+      </w:pPr>
+    </w:p>
+    <w:p>
+      <w:pPr>
+        <w:spacing w:after="0"/>
+        <w:rPr>
+          <w:rFonts w:ascii="Consolas" w:hAnsi="Consolas"/>
+          <w:sz w:val="18"/>
+          <w:szCs w:val="18"/>
+        </w:rPr>
+      </w:pPr>
+      <w:r>
+        <w:rPr>
+          <w:rFonts w:ascii="Consolas" w:hAnsi="Consolas"/>
+          <w:sz w:val="18"/>
+          <w:szCs w:val="18"/>
+        </w:rPr>
+        <w:t>// FRIENDS_WITH relationships (bidirectional)</w:t>
+      </w:r>
+    </w:p>
+    <w:p>
+      <w:pPr>
+        <w:spacing w:after="0"/>
+        <w:rPr>
+          <w:rFonts w:ascii="Consolas" w:hAnsi="Consolas"/>
+          <w:sz w:val="18"/>
+          <w:szCs w:val="18"/>
+        </w:rPr>
+      </w:pPr>
+    </w:p>
+    <w:p>
+      <w:pPr>
+        <w:spacing w:after="0"/>
+        <w:rPr>
+          <w:rFonts w:ascii="Consolas" w:hAnsi="Consolas"/>
+          <w:sz w:val="18"/>
+          <w:szCs w:val="18"/>
+        </w:rPr>
+      </w:pPr>
+      <w:r>
+        <w:rPr>
+          <w:rFonts w:ascii="Consolas" w:hAnsi="Consolas"/>
+          <w:sz w:val="18"/>
+          <w:szCs w:val="18"/>
+        </w:rPr>
+        <w:t xml:space="preserve">  (a)-[:FRIENDS_WITH]-&gt;(d), (d)-[:FRIENDS_WITH]-&gt;(a),</w:t>
+      </w:r>
+    </w:p>
+    <w:p>
+      <w:pPr>
+        <w:spacing w:after="0"/>
+        <w:rPr>
+          <w:rFonts w:ascii="Consolas" w:hAnsi="Consolas"/>
+          <w:sz w:val="18"/>
+          <w:szCs w:val="18"/>
+        </w:rPr>
+      </w:pPr>
+      <w:r>
+        <w:rPr>
+          <w:rFonts w:ascii="Consolas" w:hAnsi="Consolas"/>
+          <w:sz w:val="18"/>
+          <w:szCs w:val="18"/>
+        </w:rPr>
+        <w:t xml:space="preserve">  (b)-[:FRIENDS_WITH]-&gt;(e), (e)-[:FRIENDS_WITH]-&gt;(b),</w:t>
+      </w:r>
+    </w:p>
+    <w:p>
+      <w:pPr>
+        <w:spacing w:after="0"/>
+        <w:rPr>
+          <w:rFonts w:ascii="Consolas" w:hAnsi="Consolas"/>
+          <w:sz w:val="18"/>
+          <w:szCs w:val="18"/>
+        </w:rPr>
+      </w:pPr>
+      <w:r>
+        <w:rPr>
+          <w:rFonts w:ascii="Consolas" w:hAnsi="Consolas"/>
+          <w:sz w:val="18"/>
+          <w:szCs w:val="18"/>
+        </w:rPr>
+        <w:t xml:space="preserve">  (c)-[:FRIENDS_WITH]-&gt;(g), (g)-[:FRIENDS_WITH]-&gt;(c),</w:t>
+      </w:r>
+    </w:p>
+    <w:p>
+      <w:pPr>
+        <w:spacing w:after="0"/>
+        <w:rPr>
+          <w:rFonts w:ascii="Consolas" w:hAnsi="Consolas"/>
+          <w:sz w:val="18"/>
+          <w:szCs w:val="18"/>
+        </w:rPr>
+      </w:pPr>
+      <w:r>
+        <w:rPr>
+          <w:rFonts w:ascii="Consolas" w:hAnsi="Consolas"/>
+          <w:sz w:val="18"/>
+          <w:szCs w:val="18"/>
+        </w:rPr>
+        <w:t xml:space="preserve">  (h)-[:FRIENDS_WITH]-&gt;(</w:t>
+      </w:r>
+      <w:proofErr w:type="spellStart"/>
+      <w:r>
+        <w:rPr>
+          <w:rFonts w:ascii="Consolas" w:hAnsi="Consolas"/>
+          <w:sz w:val="18"/>
+          <w:szCs w:val="18"/>
+        </w:rPr>
+        <w:t>i</w:t>
+      </w:r>
+      <w:proofErr w:type="spellEnd"/>
+      <w:r>
+        <w:rPr>
+          <w:rFonts w:ascii="Consolas" w:hAnsi="Consolas"/>
+          <w:sz w:val="18"/>
+          <w:szCs w:val="18"/>
+        </w:rPr>
+        <w:t>), (</w:t>
+      </w:r>
+      <w:proofErr w:type="spellStart"/>
+      <w:r>
+        <w:rPr>
+          <w:rFonts w:ascii="Consolas" w:hAnsi="Consolas"/>
+          <w:sz w:val="18"/>
+          <w:szCs w:val="18"/>
+        </w:rPr>
+        <w:t>i</w:t>
+      </w:r>
+      <w:proofErr w:type="spellEnd"/>
+      <w:r>
+        <w:rPr>
+          <w:rFonts w:ascii="Consolas" w:hAnsi="Consolas"/>
+          <w:sz w:val="18"/>
+          <w:szCs w:val="18"/>
+        </w:rPr>
+        <w:t>)-[:FRIENDS_WITH]-&gt;(h),</w:t>
       </w:r>
     </w:p>
     <w:p>
@@ -20719,7 +22189,7 @@
           <w:noProof/>
         </w:rPr>
         <w:drawing>
-          <wp:anchor distT="0" distB="0" distL="114300" distR="114300" simplePos="0" relativeHeight="251665408" behindDoc="1" locked="0" layoutInCell="1" allowOverlap="1" wp14:anchorId="20E09602" wp14:editId="78AF3A63">
+          <wp:anchor distT="0" distB="0" distL="114300" distR="114300" simplePos="0" relativeHeight="251665408" behindDoc="1" locked="0" layoutInCell="1" allowOverlap="1" wp14:anchorId="20E09602" wp14:editId="264DA695">
             <wp:simplePos x="0" y="0"/>
             <wp:positionH relativeFrom="column">
               <wp:posOffset>0</wp:posOffset>
@@ -20992,7 +22462,15 @@
         <w:t xml:space="preserve">User </w:t>
       </w:r>
       <w:r>
-        <w:t>‘Dinuka’</w:t>
+        <w:t>‘</w:t>
+      </w:r>
+      <w:proofErr w:type="spellStart"/>
+      <w:r>
+        <w:t>Dinuka</w:t>
+      </w:r>
+      <w:proofErr w:type="spellEnd"/>
+      <w:r>
+        <w:t>’</w:t>
       </w:r>
       <w:r>
         <w:t xml:space="preserve"> </w:t>
@@ -21034,15 +22512,47 @@
         <w:spacing w:after="0"/>
       </w:pPr>
       <w:r>
-        <w:t>MATCH (a:User {name:'Dinuka'})--(u:User)</w:t>
-      </w:r>
-    </w:p>
-    <w:p>
-      <w:pPr>
-        <w:spacing w:after="0"/>
-      </w:pPr>
-      <w:r>
-        <w:t>RETURN DISTINCT u.name AS Connected_To_Dinuka;</w:t>
+        <w:t>MATCH (</w:t>
+      </w:r>
+      <w:proofErr w:type="spellStart"/>
+      <w:r>
+        <w:t>a:User</w:t>
+      </w:r>
+      <w:proofErr w:type="spellEnd"/>
+      <w:r>
+        <w:t xml:space="preserve"> {name:'</w:t>
+      </w:r>
+      <w:proofErr w:type="spellStart"/>
+      <w:r>
+        <w:t>Dinuka</w:t>
+      </w:r>
+      <w:proofErr w:type="spellEnd"/>
+      <w:r>
+        <w:t>'})--(</w:t>
+      </w:r>
+      <w:proofErr w:type="spellStart"/>
+      <w:r>
+        <w:t>u:User</w:t>
+      </w:r>
+      <w:proofErr w:type="spellEnd"/>
+      <w:r>
+        <w:t>)</w:t>
+      </w:r>
+    </w:p>
+    <w:p>
+      <w:pPr>
+        <w:spacing w:after="0"/>
+      </w:pPr>
+      <w:r>
+        <w:t xml:space="preserve">RETURN DISTINCT u.name AS </w:t>
+      </w:r>
+      <w:proofErr w:type="spellStart"/>
+      <w:r>
+        <w:t>Connected_To_Dinuka</w:t>
+      </w:r>
+      <w:proofErr w:type="spellEnd"/>
+      <w:r>
+        <w:t>;</w:t>
       </w:r>
     </w:p>
     <w:p>
@@ -21082,7 +22592,7 @@
           <w:noProof/>
         </w:rPr>
         <w:drawing>
-          <wp:anchor distT="0" distB="0" distL="114300" distR="114300" simplePos="0" relativeHeight="251668480" behindDoc="1" locked="0" layoutInCell="1" allowOverlap="1" wp14:anchorId="12850A8E" wp14:editId="36B5D4BD">
+          <wp:anchor distT="0" distB="0" distL="114300" distR="114300" simplePos="0" relativeHeight="251668480" behindDoc="1" locked="0" layoutInCell="1" allowOverlap="1" wp14:anchorId="12850A8E" wp14:editId="1F9806E8">
             <wp:simplePos x="0" y="0"/>
             <wp:positionH relativeFrom="column">
               <wp:posOffset>205740</wp:posOffset>
@@ -21228,7 +22738,23 @@
         </w:rPr>
       </w:pPr>
       <w:r>
-        <w:t xml:space="preserve">(a:User {name:'Dinuka'}) means </w:t>
+        <w:t>(</w:t>
+      </w:r>
+      <w:proofErr w:type="spellStart"/>
+      <w:r>
+        <w:t>a:User</w:t>
+      </w:r>
+      <w:proofErr w:type="spellEnd"/>
+      <w:r>
+        <w:t xml:space="preserve"> {name:'</w:t>
+      </w:r>
+      <w:proofErr w:type="spellStart"/>
+      <w:r>
+        <w:t>Dinuka</w:t>
+      </w:r>
+      <w:proofErr w:type="spellEnd"/>
+      <w:r>
+        <w:t xml:space="preserve">'}) means </w:t>
       </w:r>
       <w:r>
         <w:t xml:space="preserve">start by finding a </w:t>
@@ -21255,7 +22781,27 @@
           <w:i/>
           <w:iCs/>
         </w:rPr>
-        <w:t>'Dinuka'</w:t>
+        <w:t>'</w:t>
+      </w:r>
+      <w:proofErr w:type="spellStart"/>
+      <w:r>
+        <w:rPr>
+          <w:b/>
+          <w:bCs/>
+          <w:i/>
+          <w:iCs/>
+        </w:rPr>
+        <w:t>Dinuka</w:t>
+      </w:r>
+      <w:proofErr w:type="spellEnd"/>
+      <w:r>
+        <w:rPr>
+          <w:b/>
+          <w:bCs/>
+          <w:i/>
+          <w:iCs/>
+        </w:rPr>
+        <w:t>'</w:t>
       </w:r>
     </w:p>
     <w:p>
@@ -21379,8 +22925,13 @@
         <w:t>S</w:t>
       </w:r>
       <w:r>
-        <w:t xml:space="preserve"> Connected_To_Dinuka</w:t>
-      </w:r>
+        <w:t xml:space="preserve"> </w:t>
+      </w:r>
+      <w:proofErr w:type="spellStart"/>
+      <w:r>
+        <w:t>Connected_To_Dinuka</w:t>
+      </w:r>
+      <w:proofErr w:type="spellEnd"/>
       <w:r>
         <w:t xml:space="preserve"> gives the column a readable name in the results</w:t>
       </w:r>
@@ -21452,7 +23003,15 @@
         <w:spacing w:after="0"/>
       </w:pPr>
       <w:r>
-        <w:t>MATCH (u:User)</w:t>
+        <w:t>MATCH (</w:t>
+      </w:r>
+      <w:proofErr w:type="spellStart"/>
+      <w:r>
+        <w:t>u:User</w:t>
+      </w:r>
+      <w:proofErr w:type="spellEnd"/>
+      <w:r>
+        <w:t>)</w:t>
       </w:r>
     </w:p>
     <w:p>
@@ -21476,23 +23035,41 @@
         <w:spacing w:after="0"/>
       </w:pPr>
       <w:r>
-        <w:t>WITH u, COUNT(DISTINCT out) + COUNT(DISTINCT in) AS TotalConnections</w:t>
-      </w:r>
-    </w:p>
-    <w:p>
-      <w:pPr>
-        <w:spacing w:after="0"/>
-      </w:pPr>
-      <w:r>
-        <w:t>RETURN u.name AS User, TotalConnections</w:t>
-      </w:r>
-    </w:p>
-    <w:p>
-      <w:pPr>
-        <w:spacing w:after="0"/>
-      </w:pPr>
-      <w:r>
-        <w:t>ORDER BY TotalConnections DESC</w:t>
+        <w:t xml:space="preserve">WITH u, COUNT(DISTINCT out) + COUNT(DISTINCT in) AS </w:t>
+      </w:r>
+      <w:proofErr w:type="spellStart"/>
+      <w:r>
+        <w:t>TotalConnections</w:t>
+      </w:r>
+      <w:proofErr w:type="spellEnd"/>
+    </w:p>
+    <w:p>
+      <w:pPr>
+        <w:spacing w:after="0"/>
+      </w:pPr>
+      <w:r>
+        <w:t xml:space="preserve">RETURN u.name AS User, </w:t>
+      </w:r>
+      <w:proofErr w:type="spellStart"/>
+      <w:r>
+        <w:t>TotalConnections</w:t>
+      </w:r>
+      <w:proofErr w:type="spellEnd"/>
+    </w:p>
+    <w:p>
+      <w:pPr>
+        <w:spacing w:after="0"/>
+      </w:pPr>
+      <w:r>
+        <w:t xml:space="preserve">ORDER BY </w:t>
+      </w:r>
+      <w:proofErr w:type="spellStart"/>
+      <w:r>
+        <w:t>TotalConnections</w:t>
+      </w:r>
+      <w:proofErr w:type="spellEnd"/>
+      <w:r>
+        <w:t xml:space="preserve"> DESC</w:t>
       </w:r>
     </w:p>
     <w:p>
@@ -21676,7 +23253,15 @@
         <w:t xml:space="preserve">ndirect connections </w:t>
       </w:r>
       <w:r>
-        <w:t>of ‘Dinuka’</w:t>
+        <w:t>of ‘</w:t>
+      </w:r>
+      <w:proofErr w:type="spellStart"/>
+      <w:r>
+        <w:t>Dinuka</w:t>
+      </w:r>
+      <w:proofErr w:type="spellEnd"/>
+      <w:r>
+        <w:t>’</w:t>
       </w:r>
     </w:p>
     <w:p>
@@ -21722,15 +23307,47 @@
         <w:spacing w:after="0"/>
       </w:pPr>
       <w:r>
-        <w:t>MATCH (a:User {name:'Dinuka'})-[:FOLLOWS*2..3]-&gt;(b:User)</w:t>
-      </w:r>
-    </w:p>
-    <w:p>
-      <w:pPr>
-        <w:spacing w:after="0"/>
-      </w:pPr>
-      <w:r>
-        <w:t>RETURN DISTINCT b.name AS IndirectConnections;</w:t>
+        <w:t>MATCH (</w:t>
+      </w:r>
+      <w:proofErr w:type="spellStart"/>
+      <w:r>
+        <w:t>a:User</w:t>
+      </w:r>
+      <w:proofErr w:type="spellEnd"/>
+      <w:r>
+        <w:t xml:space="preserve"> {name:'</w:t>
+      </w:r>
+      <w:proofErr w:type="spellStart"/>
+      <w:r>
+        <w:t>Dinuka</w:t>
+      </w:r>
+      <w:proofErr w:type="spellEnd"/>
+      <w:r>
+        <w:t>'})-[:FOLLOWS*2..3]-&gt;(</w:t>
+      </w:r>
+      <w:proofErr w:type="spellStart"/>
+      <w:r>
+        <w:t>b:User</w:t>
+      </w:r>
+      <w:proofErr w:type="spellEnd"/>
+      <w:r>
+        <w:t>)</w:t>
+      </w:r>
+    </w:p>
+    <w:p>
+      <w:pPr>
+        <w:spacing w:after="0"/>
+      </w:pPr>
+      <w:r>
+        <w:t xml:space="preserve">RETURN DISTINCT b.name AS </w:t>
+      </w:r>
+      <w:proofErr w:type="spellStart"/>
+      <w:r>
+        <w:t>IndirectConnections</w:t>
+      </w:r>
+      <w:proofErr w:type="spellEnd"/>
+      <w:r>
+        <w:t>;</w:t>
       </w:r>
     </w:p>
     <w:p>
@@ -21912,10 +23529,456 @@
       </w:r>
     </w:p>
     <w:p>
-      <w:pPr>
-        <w:spacing w:after="0"/>
-      </w:pPr>
-    </w:p>
+      <w:r>
+        <w:br w:type="page"/>
+      </w:r>
+    </w:p>
+    <w:p>
+      <w:pPr>
+        <w:pStyle w:val="Heading1"/>
+      </w:pPr>
+      <w:r>
+        <w:lastRenderedPageBreak/>
+        <w:t>Task 5: Self Study – Big Data Technologies in Large Language Model Development</w:t>
+      </w:r>
+    </w:p>
+    <w:p>
+      <w:pPr>
+        <w:pStyle w:val="Heading3"/>
+      </w:pPr>
+      <w:r>
+        <w:t>Abstract</w:t>
+      </w:r>
+    </w:p>
+    <w:p>
+      <w:pPr>
+        <w:ind w:firstLine="720"/>
+        <w:jc w:val="both"/>
+      </w:pPr>
+      <w:r>
+        <w:t>This comprehensive survey looks into big data technologies that have been integrated in the development, verification, and deployment of Large Language Models based on international research from 2024-2025. We analyze research from the leading institutions in the United States, Europe, Canada, and other regions to understand how big data concepts and technologies are transforming the LLM lifecycle.</w:t>
+      </w:r>
+    </w:p>
+    <w:p>
+      <w:pPr>
+        <w:pStyle w:val="Heading3"/>
+      </w:pPr>
+      <w:r>
+        <w:t xml:space="preserve">5.1 </w:t>
+      </w:r>
+      <w:r>
+        <w:t>Development</w:t>
+      </w:r>
+    </w:p>
+    <w:p>
+      <w:pPr>
+        <w:spacing w:after="0"/>
+        <w:ind w:firstLine="720"/>
+        <w:jc w:val="both"/>
+      </w:pPr>
+      <w:r>
+        <w:t xml:space="preserve">Big data technologies are crucial because training </w:t>
+      </w:r>
+      <w:r>
+        <w:t>modern</w:t>
+      </w:r>
+      <w:r>
+        <w:t xml:space="preserve"> large language models like ChatGPT requires massive amounts of data and processing power. The first step in the process is gathering enormous text datasets which frequently contain trillions of words and billions of documents from books, the internet, and other sources. Singh et al. (2024) from</w:t>
+      </w:r>
+      <w:r>
+        <w:t xml:space="preserve"> t</w:t>
+      </w:r>
+      <w:r>
+        <w:t xml:space="preserve">he University of Maryland created the </w:t>
+      </w:r>
+      <w:proofErr w:type="spellStart"/>
+      <w:r>
+        <w:rPr>
+          <w:b/>
+          <w:bCs/>
+          <w:i/>
+          <w:iCs/>
+        </w:rPr>
+        <w:t>AxoNN</w:t>
+      </w:r>
+      <w:proofErr w:type="spellEnd"/>
+      <w:r>
+        <w:t xml:space="preserve"> system, which uses tens of thousands of interconnected computer processors to train AI models with up to one trillion parameters [1]. This is one of the biggest attempts at AI training that academic researchers have ever made. The main difficulty is that no single computer can handle these enormous models, so researchers must divide the work among thousands of machines in a coordinated manner.</w:t>
+      </w:r>
+    </w:p>
+    <w:p>
+      <w:pPr>
+        <w:spacing w:after="0"/>
+        <w:ind w:firstLine="720"/>
+        <w:jc w:val="both"/>
+      </w:pPr>
+      <w:r>
+        <w:t xml:space="preserve">Data preprocessing is equally important and complex. Terabytes of raw text data need to be cleaned and organized by researchers before the actual training can begin by removing duplicates, filtering low-quality content, and checking for harmful material. For that, sophisticated big data processing systems are needed to train billions of documents at once. Liu et al. (2025) of European research institutions developed a system named </w:t>
+      </w:r>
+      <w:r>
+        <w:rPr>
+          <w:b/>
+          <w:bCs/>
+          <w:i/>
+          <w:iCs/>
+        </w:rPr>
+        <w:t>"Mist"</w:t>
+      </w:r>
+      <w:r>
+        <w:t xml:space="preserve"> that optimizes how computer memory is used during training, allowing larger models to be trained more efficiently [2]. Their approach reduces memory usage up to 40%, without impacting training speed, which is critical when working with limited computing resources.</w:t>
+      </w:r>
+    </w:p>
+    <w:p>
+      <w:pPr>
+        <w:spacing w:after="0"/>
+        <w:ind w:firstLine="720"/>
+        <w:jc w:val="both"/>
+      </w:pPr>
+      <w:r>
+        <w:t xml:space="preserve">The actual training consists of feeding this preprocessed data to the AI model millions of times, with each training step requiring complex mathematical calculations across all the model's parameters. Duan et al. (2024) conducted an extensive survey of distributed training methods and found that if properly tuned, modern systems can reach efficiencies above 90%, meaning most of the computing power is actually used for learning rather than being wasted on the coordination between machines [3]. Researchers at Amazon Web Services have also made critical contributions by designing specialized computer chips called </w:t>
+      </w:r>
+      <w:proofErr w:type="spellStart"/>
+      <w:r>
+        <w:rPr>
+          <w:b/>
+          <w:bCs/>
+          <w:i/>
+          <w:iCs/>
+        </w:rPr>
+        <w:t>Trainium</w:t>
+      </w:r>
+      <w:proofErr w:type="spellEnd"/>
+      <w:r>
+        <w:t>, which are tailor-made for AI training and offer better performance per dollar compared to traditional graphics cards [4]. These advances in both software coordination and hardware design have made it possible to train increasingly powerful language models while managing the enormous computational and data processing tasks that would have been impossible just a few years ago.</w:t>
+      </w:r>
+    </w:p>
+    <w:p>
+      <w:pPr>
+        <w:pStyle w:val="Heading3"/>
+      </w:pPr>
+      <w:r>
+        <w:lastRenderedPageBreak/>
+        <w:t xml:space="preserve">5.2 </w:t>
+      </w:r>
+      <w:r>
+        <w:t>Verification</w:t>
+      </w:r>
+    </w:p>
+    <w:p>
+      <w:pPr>
+        <w:ind w:firstLine="720"/>
+        <w:jc w:val="both"/>
+      </w:pPr>
+      <w:r>
+        <w:rPr>
+          <w:highlight w:val="yellow"/>
+        </w:rPr>
+        <w:t>Large language models pose a unique set of challenges when it comes to assessing whether or not they work correctly, challenges that traditional testing methods cannot handle effectively. While you can check if certain functions produce a specific output in conventional software, language models create creative text that can be correct in many different ways, making evaluation much more complex. Traditional metrics, such as BLEU scores, which are based on counting matching words between model outputs and reference answers, have proven inadequate for assessing modern AI language capabilities.</w:t>
+      </w:r>
+      <w:r>
+        <w:t xml:space="preserve"> This limitation has driven researchers to devise innovative evaluation methodologies using AI itself to judge the performances of artificial intelligence.</w:t>
+      </w:r>
+    </w:p>
+    <w:p>
+      <w:pPr>
+        <w:ind w:firstLine="720"/>
+        <w:jc w:val="both"/>
+      </w:pPr>
+      <w:r>
+        <w:t>The most significant breakthrough in the evaluation of LLMs has been the development of "LLM-as-a-Judge" systems, where other advanced language models are used to evaluate AI responses across many dimensions including accuracy, helpfulness, safety, and coherence. Recent research has shown that these AI judges can achieve more than 80% agreement with human evaluators while processing millions of test cases in a fraction of the time needed for human review [5]. This allows researchers to do comprehensive evaluations that would be impossibly expensive and time-consuming with human evaluators. The key insight is that the advanced language models have developed enough understanding of language quality and correctness to serve as reliable assessments of other models' performance.</w:t>
+      </w:r>
+    </w:p>
+    <w:p>
+      <w:pPr>
+        <w:ind w:firstLine="720"/>
+        <w:jc w:val="both"/>
+      </w:pPr>
+      <w:r>
+        <w:t>But AI-based evaluation systems also present several challenges, especially in respect to bias and consistency. For example, researchers have found that AI judges may suffer from position bias (a preference for positions of the answer), length bias-a preference for longer responses-and cultural biases inherited from their training data. In response, international research teams have developed a range of sophisticated approaches, including multi-judge systems, bias detection algorithms, and calibration methods that ensure fair evaluation across different types of content and cultural contexts. Another critical innovation has been dynamic benchmark creation, whereby evaluation tests are continually updated and changed to prevent models from simply memorizing answers to static test questions. This ensures that evaluation remains meaningful in a world of rapidly improving AI capabilities and provides reliable measures of true language understanding rather than pattern matching.</w:t>
+      </w:r>
+    </w:p>
+    <w:p>
+      <w:pPr>
+        <w:ind w:firstLine="720"/>
+        <w:jc w:val="both"/>
+      </w:pPr>
+    </w:p>
+    <w:p>
+      <w:pPr>
+        <w:pStyle w:val="Heading3"/>
+      </w:pPr>
+      <w:r>
+        <w:t xml:space="preserve">5.3 </w:t>
+      </w:r>
+      <w:r>
+        <w:t>Deployment</w:t>
+      </w:r>
+    </w:p>
+    <w:p>
+      <w:pPr>
+        <w:ind w:firstLine="720"/>
+        <w:jc w:val="both"/>
+      </w:pPr>
+      <w:r>
+        <w:t>Large language models require sophisticated infrastructure when deployed in real-world applications to serve millions of users simultaneously with fast response times and reasonable cost. The requirements for inferenc</w:t>
+      </w:r>
+      <w:r>
+        <w:t>ing</w:t>
+      </w:r>
+      <w:r>
+        <w:t xml:space="preserve"> </w:t>
+      </w:r>
+      <w:r>
+        <w:t>basically</w:t>
+      </w:r>
+      <w:r>
+        <w:t xml:space="preserve"> </w:t>
+      </w:r>
+      <w:r>
+        <w:t>differ</w:t>
+      </w:r>
+      <w:r>
+        <w:t xml:space="preserve"> from training and </w:t>
+      </w:r>
+      <w:r>
+        <w:t>have</w:t>
+      </w:r>
+      <w:r>
+        <w:t xml:space="preserve"> unique engineering challenges. In particular, during inference, the system needs to process the user inputs quickly while managing enormous model parameters, which can take hundreds of gigabytes of memory. </w:t>
+      </w:r>
+      <w:r>
+        <w:rPr>
+          <w:b/>
+          <w:bCs/>
+          <w:i/>
+          <w:iCs/>
+        </w:rPr>
+        <w:t>Meta's</w:t>
+      </w:r>
+      <w:r>
+        <w:t xml:space="preserve"> research teams have led the development of techniques for inference optimization, building methods that can serve their largest models to billions of Facebook users with response </w:t>
+      </w:r>
+      <w:r>
+        <w:lastRenderedPageBreak/>
+        <w:t>times under one second [6]. Their approach relies on three types of parallelism: dividing model computations across many processors, dividing different parts of long conversations between machines, and optimizing how different model components communicate with each other.</w:t>
+      </w:r>
+    </w:p>
+    <w:p>
+      <w:pPr>
+        <w:ind w:firstLine="720"/>
+        <w:jc w:val="both"/>
+      </w:pPr>
+      <w:r>
+        <w:t>As a result, edge computing integration has emerged as an essential factor in minimizing latency and increasing privacy in the deployment of LLMs. Researchers are working out methods to operate smaller, optimized versions of language models on devices closer to users, such as smartphones and local servers, rather than running all requests through centralized data centers. This involves model compression techniques including quantization or decreasing the precision of mathematical calculations, pruning or removal of redundant components of the model, and knowledge distillation or training smaller models to act like their larger counterparts. In the last few years, this has become possible: running billion-parameter models on consumer devices without sacrificing most of their original capabilities.</w:t>
+      </w:r>
+    </w:p>
+    <w:p>
+      <w:pPr>
+        <w:ind w:firstLine="720"/>
+        <w:jc w:val="both"/>
+        <w:rPr>
+          <w:highlight w:val="yellow"/>
+        </w:rPr>
+      </w:pPr>
+      <w:r>
+        <w:t>Big data system integrations have allowed for newer applications where the language models can analyze and generate insights from large databases in real time. Databricks researchers have developed systems capable of processing more than 400 billion text tokens in batch operations, enabling companies to apply AI analysis to their entire document collections efficiently [7</w:t>
+      </w:r>
+      <w:r>
+        <w:rPr>
+          <w:highlight w:val="yellow"/>
+        </w:rPr>
+        <w:t>]. These systems put together traditional big data processing frameworks like Apache Spark and modern AI inference engines to form unified platforms where data preprocessing, AI analysis, and result generation happen seamlessly. Treating the inference of language models as another step in big data processing pipelines, rather than as a different system, forms the key innovation that dramatically simplifies deployment and reduces operational complexity for organizations wanting to integrate AI capabilities into their existing data infrastructure.</w:t>
+      </w:r>
+    </w:p>
+    <w:p>
+      <w:pPr>
+        <w:ind w:firstLine="720"/>
+        <w:jc w:val="both"/>
+        <w:rPr>
+          <w:highlight w:val="yellow"/>
+        </w:rPr>
+      </w:pPr>
+    </w:p>
+    <w:p>
+      <w:pPr>
+        <w:pStyle w:val="Heading3"/>
+      </w:pPr>
+      <w:r>
+        <w:t>References</w:t>
+      </w:r>
+    </w:p>
+    <w:p>
+      <w:r>
+        <w:t xml:space="preserve">[1] Singh, S., Singhania, P., Ranjan, A., Kirchenbauer, J., </w:t>
+      </w:r>
+      <w:proofErr w:type="spellStart"/>
+      <w:r>
+        <w:t>Geiping</w:t>
+      </w:r>
+      <w:proofErr w:type="spellEnd"/>
+      <w:r>
+        <w:t xml:space="preserve">, J., Wen, Y., Jain, N., Hans, A., Shu, M., Tomar, A., Goldstein, T., &amp; </w:t>
+      </w:r>
+      <w:proofErr w:type="spellStart"/>
+      <w:r>
+        <w:t>Bhatele</w:t>
+      </w:r>
+      <w:proofErr w:type="spellEnd"/>
+      <w:r>
+        <w:t xml:space="preserve">, A. (2024). Democratizing AI: Open-source Scalable LLM Training on GPU-based Supercomputers. </w:t>
+      </w:r>
+      <w:r>
+        <w:rPr>
+          <w:i/>
+          <w:iCs/>
+        </w:rPr>
+        <w:t>Proceedings of the International Conference for High Performance Computing, Networking, Storage, and Analysis (SC '24)</w:t>
+      </w:r>
+      <w:r>
+        <w:t>. DOI: 10.1109/SC41406.2024.00010</w:t>
+      </w:r>
+    </w:p>
+    <w:p>
+      <w:r>
+        <w:t xml:space="preserve">[2] Liu, G., Miao, Y., Lin, Z., Shi, X., Maleki, S., Yang, F., Bao, Y., &amp; Wang, S. (2025). Mist: Efficient Distributed Training of Large Language Models via Memory-Parallelism Co-Optimization. </w:t>
+      </w:r>
+      <w:r>
+        <w:rPr>
+          <w:i/>
+          <w:iCs/>
+        </w:rPr>
+        <w:t>Proceedings of the Twentieth European Conference on Computer Systems (</w:t>
+      </w:r>
+      <w:proofErr w:type="spellStart"/>
+      <w:r>
+        <w:rPr>
+          <w:i/>
+          <w:iCs/>
+        </w:rPr>
+        <w:t>EuroSys</w:t>
+      </w:r>
+      <w:proofErr w:type="spellEnd"/>
+      <w:r>
+        <w:rPr>
+          <w:i/>
+          <w:iCs/>
+        </w:rPr>
+        <w:t xml:space="preserve"> '25)</w:t>
+      </w:r>
+      <w:r>
+        <w:t>. DOI: 10.1145/3689031.3717461</w:t>
+      </w:r>
+    </w:p>
+    <w:p>
+      <w:r>
+        <w:t xml:space="preserve">[3] Duan, J., Zhang, S., Wang, Z., Jiang, L., Qu, W., Hu, Q., Wang, G., et al. (2024). Efficient Training of Large Language Models on Distributed Infrastructures: A Survey. </w:t>
+      </w:r>
+      <w:proofErr w:type="spellStart"/>
+      <w:r>
+        <w:rPr>
+          <w:i/>
+          <w:iCs/>
+        </w:rPr>
+        <w:t>arXiv</w:t>
+      </w:r>
+      <w:proofErr w:type="spellEnd"/>
+      <w:r>
+        <w:rPr>
+          <w:i/>
+          <w:iCs/>
+        </w:rPr>
+        <w:t xml:space="preserve"> preprint arXiv:2407.20018</w:t>
+      </w:r>
+      <w:r>
+        <w:t>.</w:t>
+      </w:r>
+    </w:p>
+    <w:p>
+      <w:r>
+        <w:lastRenderedPageBreak/>
+        <w:t xml:space="preserve">[4] Fan, H., Zhou, H., Huang, G., Raman, P., Fu, X., Gupta, G., Ram, D., Wang, Y., &amp; Huan, J. (2024). Distributed Training of Large Language Models on AWS </w:t>
+      </w:r>
+      <w:proofErr w:type="spellStart"/>
+      <w:r>
+        <w:t>Trainium</w:t>
+      </w:r>
+      <w:proofErr w:type="spellEnd"/>
+      <w:r>
+        <w:t xml:space="preserve">. </w:t>
+      </w:r>
+      <w:r>
+        <w:rPr>
+          <w:i/>
+          <w:iCs/>
+        </w:rPr>
+        <w:t>Proceedings of the 2024 ACM Symposium on Cloud Computing (SOCC '24)</w:t>
+      </w:r>
+      <w:r>
+        <w:t>. DOI: 10.1145/3698038.3698535</w:t>
+      </w:r>
+    </w:p>
+    <w:p>
+      <w:r>
+        <w:t xml:space="preserve">[5] Gu, Y., et al. (2025). LLM-as-a-Judge: Automated Evaluation of Search Query Parsing Using Large Language Models. </w:t>
+      </w:r>
+      <w:r>
+        <w:rPr>
+          <w:i/>
+          <w:iCs/>
+        </w:rPr>
+        <w:t>Frontiers in Big Data</w:t>
+      </w:r>
+      <w:r>
+        <w:t>, 2025. DOI: 10.3389/fdata.2025.1611389</w:t>
+      </w:r>
+    </w:p>
+    <w:p>
+      <w:r>
+        <w:t xml:space="preserve">[6] Meta AI Engineering Team (2024). Scaling LLM Inference: Innovations in Tensor Parallelism, Context Parallelism, and Expert Parallelism. </w:t>
+      </w:r>
+      <w:r>
+        <w:rPr>
+          <w:i/>
+          <w:iCs/>
+        </w:rPr>
+        <w:t>Engineering at Meta Technical Blog</w:t>
+      </w:r>
+      <w:r>
+        <w:t xml:space="preserve">. Available: </w:t>
+      </w:r>
+      <w:hyperlink r:id="rId28" w:history="1">
+        <w:r>
+          <w:rPr>
+            <w:rStyle w:val="Hyperlink"/>
+          </w:rPr>
+          <w:t>https://engineering.fb.com/2025/10/17/ai-research/scaling-llm-inference-innovations-tensor-parallelism-context-parallelism-expert-parallelism/</w:t>
+        </w:r>
+      </w:hyperlink>
+    </w:p>
+    <w:p>
+      <w:r>
+        <w:t xml:space="preserve">[7] Databricks Research Team (2024). Introducing Simple, Fast, and Scalable Batch LLM Inference on Mosaic AI Model Serving. </w:t>
+      </w:r>
+      <w:r>
+        <w:rPr>
+          <w:i/>
+          <w:iCs/>
+        </w:rPr>
+        <w:t>Databricks Technical Blog</w:t>
+      </w:r>
+      <w:r>
+        <w:t xml:space="preserve">. Available: </w:t>
+      </w:r>
+      <w:hyperlink r:id="rId29" w:history="1">
+        <w:r>
+          <w:rPr>
+            <w:rStyle w:val="Hyperlink"/>
+          </w:rPr>
+          <w:t>https://www.databricks.com/blog/introducing-simple-fast-and-scalable-batch-llm-inference-mosaic-ai-model-serving</w:t>
+        </w:r>
+      </w:hyperlink>
+    </w:p>
+    <w:p/>
     <w:sectPr>
       <w:pgSz w:w="12240" w:h="15840"/>
       <w:pgMar w:top="810" w:right="900" w:bottom="900" w:left="1440" w:header="720" w:footer="720" w:gutter="0"/>
@@ -29579,6 +31642,18 @@
       <w:u w:val="single"/>
     </w:rPr>
   </w:style>
+  <w:style w:type="character" w:styleId="UnresolvedMention">
+    <w:name w:val="Unresolved Mention"/>
+    <w:basedOn w:val="DefaultParagraphFont"/>
+    <w:uiPriority w:val="99"/>
+    <w:semiHidden/>
+    <w:unhideWhenUsed/>
+    <w:rsid w:val="007F7C98"/>
+    <w:rPr>
+      <w:color w:val="605E5C"/>
+      <w:shd w:val="clear" w:color="auto" w:fill="E1DFDD"/>
+    </w:rPr>
+  </w:style>
 </w:styles>
 </file>
 
@@ -29651,6 +31726,7 @@
     <w:sig w:usb0="00000000" w:usb1="10000000" w:usb2="00000000" w:usb3="00000000" w:csb0="80000000" w:csb1="00000000"/>
   </w:font>
   <w:font w:name="Times New Roman">
+    <w:altName w:val="Times New Roman PS"/>
     <w:panose1 w:val="02020603050405020304"/>
     <w:charset w:val="00"/>
     <w:family w:val="roman"/>
@@ -29731,9 +31807,12 @@
   </w:compat>
   <w:rsids>
     <w:rsidRoot w:val="00A909C5"/>
+    <w:rsid w:val="00020AB8"/>
     <w:rsid w:val="0008293B"/>
+    <w:rsid w:val="000962B5"/>
     <w:rsid w:val="001A5D21"/>
     <w:rsid w:val="00A909C5"/>
+    <w:rsid w:val="00E46351"/>
   </w:rsids>
   <m:mathPr>
     <m:mathFont m:val="Cambria Math"/>

</xml_diff>